<commit_message>
mini update use case
</commit_message>
<xml_diff>
--- a/Relazione Ingegneria del Software/Template Use Case.docx
+++ b/Relazione Ingegneria del Software/Template Use Case.docx
@@ -2681,14 +2681,7 @@
                 <w:rFonts w:ascii="Arial" w:eastAsia="Times New Roman" w:hAnsi="Arial" w:cs="Arial"/>
                 <w:lang w:val="it-IT"/>
               </w:rPr>
-              <w:t>Registrazione</w:t>
-            </w:r>
-            <w:r>
-              <w:rPr>
-                <w:rFonts w:ascii="Arial" w:eastAsia="Times New Roman" w:hAnsi="Arial" w:cs="Arial"/>
-                <w:lang w:val="it-IT"/>
-              </w:rPr>
-              <w:t>AssunzioneFarmaco</w:t>
+              <w:t>RegistrazioneAssunzioneFarmaco</w:t>
             </w:r>
             <w:proofErr w:type="spellEnd"/>
           </w:p>
@@ -2841,14 +2834,7 @@
                 <w:rFonts w:ascii="Arial" w:eastAsia="Times New Roman" w:hAnsi="Arial" w:cs="Arial"/>
                 <w:lang w:val="it-IT"/>
               </w:rPr>
-              <w:t xml:space="preserve">Il paziente </w:t>
-            </w:r>
-            <w:r>
-              <w:rPr>
-                <w:rFonts w:ascii="Arial" w:eastAsia="Times New Roman" w:hAnsi="Arial" w:cs="Arial"/>
-                <w:lang w:val="it-IT"/>
-              </w:rPr>
-              <w:t>registra l’assunzione di un farmaco</w:t>
+              <w:t>Il paziente registra l’assunzione di un farmaco</w:t>
             </w:r>
           </w:p>
         </w:tc>
@@ -2924,14 +2910,7 @@
                 <w:rFonts w:ascii="Arial" w:eastAsia="Times New Roman" w:hAnsi="Arial" w:cs="Arial"/>
                 <w:lang w:val="it-IT"/>
               </w:rPr>
-              <w:t>Il paziente ha effettuato il login</w:t>
-            </w:r>
-            <w:r>
-              <w:rPr>
-                <w:rFonts w:ascii="Arial" w:eastAsia="Times New Roman" w:hAnsi="Arial" w:cs="Arial"/>
-                <w:lang w:val="it-IT"/>
-              </w:rPr>
-              <w:t>; al paziente è stata assegnata almeno una terapia dal diabetologo</w:t>
+              <w:t>Il paziente ha effettuato il login; al paziente è stata assegnata almeno una terapia dal diabetologo</w:t>
             </w:r>
           </w:p>
         </w:tc>
@@ -3012,14 +2991,7 @@
                 <w:rFonts w:ascii="Arial" w:eastAsia="Times New Roman" w:hAnsi="Arial" w:cs="Arial"/>
                 <w:lang w:val="it-IT"/>
               </w:rPr>
-              <w:t xml:space="preserve">Il paziente clicca sul pulsante “aggiungi” nella sezione </w:t>
-            </w:r>
-            <w:r>
-              <w:rPr>
-                <w:rFonts w:ascii="Arial" w:eastAsia="Times New Roman" w:hAnsi="Arial" w:cs="Arial"/>
-                <w:lang w:val="it-IT"/>
-              </w:rPr>
-              <w:t>Assunzione Farmaco</w:t>
+              <w:t>Il paziente clicca sul pulsante “aggiungi” nella sezione Assunzione Farmaco</w:t>
             </w:r>
           </w:p>
           <w:p>
@@ -3040,14 +3012,7 @@
                 <w:rFonts w:ascii="Arial" w:eastAsia="Times New Roman" w:hAnsi="Arial" w:cs="Arial"/>
                 <w:lang w:val="it-IT"/>
               </w:rPr>
-              <w:t xml:space="preserve">Il sistema chiede la data, l’ora, </w:t>
-            </w:r>
-            <w:r>
-              <w:rPr>
-                <w:rFonts w:ascii="Arial" w:eastAsia="Times New Roman" w:hAnsi="Arial" w:cs="Arial"/>
-                <w:lang w:val="it-IT"/>
-              </w:rPr>
-              <w:t>la quantità di farmaco assunta e la terapia per la quale lo si sta assumendo</w:t>
+              <w:t>Il sistema chiede la data, l’ora, la quantità di farmaco assunta e la terapia per la quale lo si sta assumendo</w:t>
             </w:r>
           </w:p>
           <w:p>
@@ -3265,14 +3230,7 @@
                 <w:rFonts w:ascii="Arial" w:eastAsia="Times New Roman" w:hAnsi="Arial" w:cs="Arial"/>
                 <w:lang w:val="it-IT"/>
               </w:rPr>
-              <w:t>L’assunzione</w:t>
-            </w:r>
-            <w:r>
-              <w:rPr>
-                <w:rFonts w:ascii="Arial" w:eastAsia="Times New Roman" w:hAnsi="Arial" w:cs="Arial"/>
-                <w:lang w:val="it-IT"/>
-              </w:rPr>
-              <w:t xml:space="preserve"> è salvata e associata al paziente</w:t>
+              <w:t>L’assunzione è salvata e associata al paziente</w:t>
             </w:r>
           </w:p>
         </w:tc>
@@ -3847,14 +3805,7 @@
                 <w:rFonts w:ascii="Arial" w:eastAsia="Times New Roman" w:hAnsi="Arial" w:cs="Arial"/>
                 <w:lang w:val="it-IT"/>
               </w:rPr>
-              <w:t xml:space="preserve">Il paziente clicca sul pulsante “aggiungi” nella sezione </w:t>
-            </w:r>
-            <w:r>
-              <w:rPr>
-                <w:rFonts w:ascii="Arial" w:eastAsia="Times New Roman" w:hAnsi="Arial" w:cs="Arial"/>
-                <w:lang w:val="it-IT"/>
-              </w:rPr>
-              <w:t>Segnalazioni</w:t>
+              <w:t>Il paziente clicca sul pulsante “aggiungi” nella sezione Segnalazioni</w:t>
             </w:r>
           </w:p>
           <w:p>
@@ -3875,14 +3826,7 @@
                 <w:rFonts w:ascii="Arial" w:eastAsia="Times New Roman" w:hAnsi="Arial" w:cs="Arial"/>
                 <w:lang w:val="it-IT"/>
               </w:rPr>
-              <w:t>Il sistema chiede la data</w:t>
-            </w:r>
-            <w:r>
-              <w:rPr>
-                <w:rFonts w:ascii="Arial" w:eastAsia="Times New Roman" w:hAnsi="Arial" w:cs="Arial"/>
-                <w:lang w:val="it-IT"/>
-              </w:rPr>
-              <w:t xml:space="preserve"> di inizio della terapia o del sintomo, opzionalmente la data di fine, e una descrizione</w:t>
+              <w:t>Il sistema chiede la data di inizio della terapia o del sintomo, opzionalmente la data di fine, e una descrizione</w:t>
             </w:r>
           </w:p>
           <w:p>
@@ -3945,21 +3889,7 @@
                 <w:rFonts w:ascii="Arial" w:eastAsia="Times New Roman" w:hAnsi="Arial" w:cs="Arial"/>
                 <w:lang w:val="it-IT"/>
               </w:rPr>
-              <w:t xml:space="preserve">Il sistema salva la </w:t>
-            </w:r>
-            <w:r>
-              <w:rPr>
-                <w:rFonts w:ascii="Arial" w:eastAsia="Times New Roman" w:hAnsi="Arial" w:cs="Arial"/>
-                <w:lang w:val="it-IT"/>
-              </w:rPr>
-              <w:t xml:space="preserve">segnalazione </w:t>
-            </w:r>
-            <w:r>
-              <w:rPr>
-                <w:rFonts w:ascii="Arial" w:eastAsia="Times New Roman" w:hAnsi="Arial" w:cs="Arial"/>
-                <w:lang w:val="it-IT"/>
-              </w:rPr>
-              <w:t>nella cartella clinica del paziente</w:t>
+              <w:t>Il sistema salva la segnalazione nella cartella clinica del paziente</w:t>
             </w:r>
           </w:p>
         </w:tc>
@@ -4113,14 +4043,7 @@
                 <w:rFonts w:ascii="Arial" w:eastAsia="Times New Roman" w:hAnsi="Arial" w:cs="Arial"/>
                 <w:lang w:val="it-IT"/>
               </w:rPr>
-              <w:t>La segnalazione</w:t>
-            </w:r>
-            <w:r>
-              <w:rPr>
-                <w:rFonts w:ascii="Arial" w:eastAsia="Times New Roman" w:hAnsi="Arial" w:cs="Arial"/>
-                <w:lang w:val="it-IT"/>
-              </w:rPr>
-              <w:t xml:space="preserve"> è salvata e associata al paziente</w:t>
+              <w:t>La segnalazione è salvata e associata al paziente</w:t>
             </w:r>
           </w:p>
         </w:tc>
@@ -4700,14 +4623,7 @@
                 <w:rFonts w:ascii="Arial" w:eastAsia="Times New Roman" w:hAnsi="Arial" w:cs="Arial"/>
                 <w:lang w:val="it-IT"/>
               </w:rPr>
-              <w:t>Il paziente ha effettuato il login</w:t>
-            </w:r>
-            <w:r>
-              <w:rPr>
-                <w:rFonts w:ascii="Arial" w:eastAsia="Times New Roman" w:hAnsi="Arial" w:cs="Arial"/>
-                <w:lang w:val="it-IT"/>
-              </w:rPr>
-              <w:t xml:space="preserve">; al paziente è associato un medico di </w:t>
+              <w:t xml:space="preserve">Il paziente ha effettuato il login; al paziente è associato un medico di </w:t>
             </w:r>
             <w:proofErr w:type="spellStart"/>
             <w:r>
@@ -5020,76 +4936,6 @@
         </w:tc>
       </w:tr>
     </w:tbl>
-    <w:p>
-      <w:pPr>
-        <w:rPr>
-          <w:lang w:val="it-IT"/>
-        </w:rPr>
-      </w:pPr>
-    </w:p>
-    <w:p>
-      <w:pPr>
-        <w:rPr>
-          <w:lang w:val="it-IT"/>
-        </w:rPr>
-      </w:pPr>
-    </w:p>
-    <w:p>
-      <w:pPr>
-        <w:rPr>
-          <w:lang w:val="it-IT"/>
-        </w:rPr>
-      </w:pPr>
-    </w:p>
-    <w:p>
-      <w:pPr>
-        <w:rPr>
-          <w:lang w:val="it-IT"/>
-        </w:rPr>
-      </w:pPr>
-    </w:p>
-    <w:p>
-      <w:pPr>
-        <w:rPr>
-          <w:lang w:val="it-IT"/>
-        </w:rPr>
-      </w:pPr>
-    </w:p>
-    <w:p>
-      <w:pPr>
-        <w:rPr>
-          <w:lang w:val="it-IT"/>
-        </w:rPr>
-      </w:pPr>
-    </w:p>
-    <w:p>
-      <w:pPr>
-        <w:rPr>
-          <w:lang w:val="it-IT"/>
-        </w:rPr>
-      </w:pPr>
-    </w:p>
-    <w:p>
-      <w:pPr>
-        <w:rPr>
-          <w:lang w:val="it-IT"/>
-        </w:rPr>
-      </w:pPr>
-    </w:p>
-    <w:p>
-      <w:pPr>
-        <w:rPr>
-          <w:lang w:val="it-IT"/>
-        </w:rPr>
-      </w:pPr>
-    </w:p>
-    <w:p>
-      <w:pPr>
-        <w:rPr>
-          <w:lang w:val="it-IT"/>
-        </w:rPr>
-      </w:pPr>
-    </w:p>
     <w:p>
       <w:pPr>
         <w:rPr>
@@ -5857,7 +5703,6 @@
                 <w:bCs/>
                 <w:lang w:val="it-IT"/>
               </w:rPr>
-              <w:lastRenderedPageBreak/>
               <w:t>Postcondizioni</w:t>
             </w:r>
             <w:proofErr w:type="spellEnd"/>
@@ -5899,6 +5744,83 @@
         </w:tc>
       </w:tr>
     </w:tbl>
+    <w:p>
+      <w:pPr>
+        <w:rPr>
+          <w:lang w:val="it-IT"/>
+        </w:rPr>
+      </w:pPr>
+    </w:p>
+    <w:p>
+      <w:pPr>
+        <w:rPr>
+          <w:lang w:val="it-IT"/>
+        </w:rPr>
+      </w:pPr>
+    </w:p>
+    <w:p>
+      <w:pPr>
+        <w:rPr>
+          <w:lang w:val="it-IT"/>
+        </w:rPr>
+      </w:pPr>
+    </w:p>
+    <w:p>
+      <w:pPr>
+        <w:rPr>
+          <w:lang w:val="it-IT"/>
+        </w:rPr>
+      </w:pPr>
+    </w:p>
+    <w:p>
+      <w:pPr>
+        <w:rPr>
+          <w:lang w:val="it-IT"/>
+        </w:rPr>
+      </w:pPr>
+    </w:p>
+    <w:p>
+      <w:pPr>
+        <w:rPr>
+          <w:lang w:val="it-IT"/>
+        </w:rPr>
+      </w:pPr>
+    </w:p>
+    <w:p>
+      <w:pPr>
+        <w:rPr>
+          <w:lang w:val="it-IT"/>
+        </w:rPr>
+      </w:pPr>
+    </w:p>
+    <w:p>
+      <w:pPr>
+        <w:rPr>
+          <w:lang w:val="it-IT"/>
+        </w:rPr>
+      </w:pPr>
+    </w:p>
+    <w:p>
+      <w:pPr>
+        <w:rPr>
+          <w:lang w:val="it-IT"/>
+        </w:rPr>
+      </w:pPr>
+    </w:p>
+    <w:p>
+      <w:pPr>
+        <w:rPr>
+          <w:lang w:val="it-IT"/>
+        </w:rPr>
+      </w:pPr>
+    </w:p>
+    <w:p>
+      <w:pPr>
+        <w:rPr>
+          <w:lang w:val="it-IT"/>
+        </w:rPr>
+      </w:pPr>
+    </w:p>
     <w:p>
       <w:pPr>
         <w:rPr>
@@ -6458,14 +6380,7 @@
                 <w:rFonts w:ascii="Arial" w:eastAsia="Times New Roman" w:hAnsi="Arial" w:cs="Arial"/>
                 <w:lang w:val="it-IT"/>
               </w:rPr>
-              <w:t xml:space="preserve">: </w:t>
-            </w:r>
-            <w:r>
-              <w:rPr>
-                <w:rFonts w:ascii="Arial" w:eastAsia="Times New Roman" w:hAnsi="Arial" w:cs="Arial"/>
-                <w:lang w:val="it-IT"/>
-              </w:rPr>
-              <w:t xml:space="preserve">fattori di rischio, patologie pregresse, </w:t>
+              <w:t xml:space="preserve">: fattori di rischio, patologie pregresse, </w:t>
             </w:r>
             <w:proofErr w:type="spellStart"/>
             <w:r>
@@ -6513,6 +6428,7 @@
                 <w:numId w:val="8"/>
               </w:numPr>
               <w:spacing w:before="210" w:after="210"/>
+              <w:jc w:val="both"/>
               <w:rPr>
                 <w:rFonts w:ascii="Arial" w:eastAsia="Times New Roman" w:hAnsi="Arial" w:cs="Arial"/>
                 <w:lang w:val="it-IT"/>
@@ -7230,14 +7146,7 @@
                 <w:rFonts w:ascii="Arial" w:eastAsia="Times New Roman" w:hAnsi="Arial" w:cs="Arial"/>
                 <w:lang w:val="it-IT"/>
               </w:rPr>
-              <w:t xml:space="preserve">Il diabetologo modifica i dati di un paziente: </w:t>
-            </w:r>
-            <w:r>
-              <w:rPr>
-                <w:rFonts w:ascii="Arial" w:eastAsia="Times New Roman" w:hAnsi="Arial" w:cs="Arial"/>
-                <w:lang w:val="it-IT"/>
-              </w:rPr>
-              <w:t xml:space="preserve">fattori di rischio, patologie pregresse, </w:t>
+              <w:t xml:space="preserve">Il diabetologo modifica i dati di un paziente: fattori di rischio, patologie pregresse, </w:t>
             </w:r>
             <w:proofErr w:type="spellStart"/>
             <w:r>
@@ -7424,14 +7333,7 @@
                 <w:rFonts w:ascii="Arial" w:eastAsia="Times New Roman" w:hAnsi="Arial" w:cs="Arial"/>
                 <w:lang w:val="it-IT"/>
               </w:rPr>
-              <w:t xml:space="preserve">Il diabetologo modifica i dati del paziente da aggiornare: </w:t>
-            </w:r>
-            <w:r>
-              <w:rPr>
-                <w:rFonts w:ascii="Arial" w:eastAsia="Times New Roman" w:hAnsi="Arial" w:cs="Arial"/>
-                <w:lang w:val="it-IT"/>
-              </w:rPr>
-              <w:t xml:space="preserve">fattori di rischio, patologie pregresse, </w:t>
+              <w:t xml:space="preserve">Il diabetologo modifica i dati del paziente da aggiornare: fattori di rischio, patologie pregresse, </w:t>
             </w:r>
             <w:proofErr w:type="spellStart"/>
             <w:r>
@@ -7447,21 +7349,7 @@
                 <w:rFonts w:ascii="Arial" w:eastAsia="Times New Roman" w:hAnsi="Arial" w:cs="Arial"/>
                 <w:lang w:val="it-IT"/>
               </w:rPr>
-              <w:t xml:space="preserve"> </w:t>
-            </w:r>
-            <w:r>
-              <w:rPr>
-                <w:rFonts w:ascii="Arial" w:eastAsia="Times New Roman" w:hAnsi="Arial" w:cs="Arial"/>
-                <w:lang w:val="it-IT"/>
-              </w:rPr>
-              <w:t>o</w:t>
-            </w:r>
-            <w:r>
-              <w:rPr>
-                <w:rFonts w:ascii="Arial" w:eastAsia="Times New Roman" w:hAnsi="Arial" w:cs="Arial"/>
-                <w:lang w:val="it-IT"/>
-              </w:rPr>
-              <w:t xml:space="preserve"> dettagli</w:t>
+              <w:t xml:space="preserve"> o dettagli</w:t>
             </w:r>
           </w:p>
           <w:p>
@@ -7506,6 +7394,59 @@
               <w:t>Il sistema salva i dati modificati</w:t>
             </w:r>
           </w:p>
+          <w:p>
+            <w:pPr>
+              <w:pStyle w:val="Paragrafoelenco"/>
+              <w:numPr>
+                <w:ilvl w:val="0"/>
+                <w:numId w:val="9"/>
+              </w:numPr>
+              <w:spacing w:before="210" w:after="210"/>
+              <w:rPr>
+                <w:rFonts w:ascii="Arial" w:eastAsia="Times New Roman" w:hAnsi="Arial" w:cs="Arial"/>
+                <w:lang w:val="it-IT"/>
+              </w:rPr>
+            </w:pPr>
+            <w:r>
+              <w:rPr>
+                <w:rFonts w:ascii="Arial" w:eastAsia="Times New Roman" w:hAnsi="Arial" w:cs="Arial"/>
+                <w:lang w:val="it-IT"/>
+              </w:rPr>
+              <w:t xml:space="preserve">Extension </w:t>
+            </w:r>
+            <w:proofErr w:type="spellStart"/>
+            <w:r>
+              <w:rPr>
+                <w:rFonts w:ascii="Arial" w:eastAsia="Times New Roman" w:hAnsi="Arial" w:cs="Arial"/>
+                <w:lang w:val="it-IT"/>
+              </w:rPr>
+              <w:t>point</w:t>
+            </w:r>
+            <w:proofErr w:type="spellEnd"/>
+            <w:r>
+              <w:rPr>
+                <w:rFonts w:ascii="Arial" w:eastAsia="Times New Roman" w:hAnsi="Arial" w:cs="Arial"/>
+                <w:lang w:val="it-IT"/>
+              </w:rPr>
+              <w:t xml:space="preserve"> (</w:t>
+            </w:r>
+            <w:proofErr w:type="spellStart"/>
+            <w:r>
+              <w:rPr>
+                <w:rFonts w:ascii="Arial" w:eastAsia="Times New Roman" w:hAnsi="Arial" w:cs="Arial"/>
+                <w:lang w:val="it-IT"/>
+              </w:rPr>
+              <w:t>ConsultazioneLog</w:t>
+            </w:r>
+            <w:proofErr w:type="spellEnd"/>
+            <w:r>
+              <w:rPr>
+                <w:rFonts w:ascii="Arial" w:eastAsia="Times New Roman" w:hAnsi="Arial" w:cs="Arial"/>
+                <w:lang w:val="it-IT"/>
+              </w:rPr>
+              <w:t>)</w:t>
+            </w:r>
+          </w:p>
         </w:tc>
       </w:tr>
       <w:tr>
@@ -7691,111 +7632,6 @@
         </w:tc>
       </w:tr>
     </w:tbl>
-    <w:p>
-      <w:pPr>
-        <w:rPr>
-          <w:lang w:val="it-IT"/>
-        </w:rPr>
-      </w:pPr>
-    </w:p>
-    <w:p>
-      <w:pPr>
-        <w:rPr>
-          <w:lang w:val="it-IT"/>
-        </w:rPr>
-      </w:pPr>
-    </w:p>
-    <w:p>
-      <w:pPr>
-        <w:rPr>
-          <w:lang w:val="it-IT"/>
-        </w:rPr>
-      </w:pPr>
-    </w:p>
-    <w:p>
-      <w:pPr>
-        <w:rPr>
-          <w:lang w:val="it-IT"/>
-        </w:rPr>
-      </w:pPr>
-    </w:p>
-    <w:p>
-      <w:pPr>
-        <w:rPr>
-          <w:lang w:val="it-IT"/>
-        </w:rPr>
-      </w:pPr>
-    </w:p>
-    <w:p>
-      <w:pPr>
-        <w:rPr>
-          <w:lang w:val="it-IT"/>
-        </w:rPr>
-      </w:pPr>
-    </w:p>
-    <w:p>
-      <w:pPr>
-        <w:rPr>
-          <w:lang w:val="it-IT"/>
-        </w:rPr>
-      </w:pPr>
-    </w:p>
-    <w:p>
-      <w:pPr>
-        <w:rPr>
-          <w:lang w:val="it-IT"/>
-        </w:rPr>
-      </w:pPr>
-    </w:p>
-    <w:p>
-      <w:pPr>
-        <w:rPr>
-          <w:lang w:val="it-IT"/>
-        </w:rPr>
-      </w:pPr>
-    </w:p>
-    <w:p>
-      <w:pPr>
-        <w:rPr>
-          <w:lang w:val="it-IT"/>
-        </w:rPr>
-      </w:pPr>
-    </w:p>
-    <w:p>
-      <w:pPr>
-        <w:rPr>
-          <w:lang w:val="it-IT"/>
-        </w:rPr>
-      </w:pPr>
-    </w:p>
-    <w:p>
-      <w:pPr>
-        <w:rPr>
-          <w:lang w:val="it-IT"/>
-        </w:rPr>
-      </w:pPr>
-    </w:p>
-    <w:p>
-      <w:pPr>
-        <w:rPr>
-          <w:lang w:val="it-IT"/>
-        </w:rPr>
-      </w:pPr>
-    </w:p>
-    <w:p>
-      <w:pPr>
-        <w:rPr>
-          <w:lang w:val="it-IT"/>
-        </w:rPr>
-      </w:pPr>
-    </w:p>
-    <w:p>
-      <w:pPr>
-        <w:rPr>
-          <w:lang w:val="it-IT"/>
-        </w:rPr>
-      </w:pPr>
-    </w:p>
     <w:p>
       <w:pPr>
         <w:rPr>
@@ -7883,6 +7719,7 @@
                 <w:bCs/>
                 <w:lang w:val="it-IT"/>
               </w:rPr>
+              <w:lastRenderedPageBreak/>
               <w:t>ID</w:t>
             </w:r>
           </w:p>
@@ -7909,6 +7746,7 @@
               <w:spacing w:before="210" w:after="210"/>
               <w:rPr>
                 <w:rFonts w:ascii="Arial" w:eastAsia="Times New Roman" w:hAnsi="Arial" w:cs="Arial"/>
+                <w:u w:val="single"/>
                 <w:lang w:val="it-IT"/>
               </w:rPr>
             </w:pPr>
@@ -7994,9 +7832,16 @@
                 <w:rFonts w:ascii="Arial" w:eastAsia="Times New Roman" w:hAnsi="Arial" w:cs="Arial"/>
                 <w:lang w:val="it-IT"/>
               </w:rPr>
-              <w:t>VisualizzazioneAndamentoGlicemia</w:t>
+              <w:t>ConsultazioneLog</w:t>
             </w:r>
             <w:proofErr w:type="spellEnd"/>
+            <w:r>
+              <w:rPr>
+                <w:rFonts w:ascii="Arial" w:eastAsia="Times New Roman" w:hAnsi="Arial" w:cs="Arial"/>
+                <w:lang w:val="it-IT"/>
+              </w:rPr>
+              <w:t xml:space="preserve"> (Estensione)</w:t>
+            </w:r>
           </w:p>
         </w:tc>
       </w:tr>
@@ -8147,7 +7992,21 @@
                 <w:rFonts w:ascii="Arial" w:eastAsia="Times New Roman" w:hAnsi="Arial" w:cs="Arial"/>
                 <w:lang w:val="it-IT"/>
               </w:rPr>
-              <w:t>Il diabetologo visualizza, tramite un grafico, l'andamento della glicemia di un paziente: giorno per giorno, settimana per settimana o mese per mese</w:t>
+              <w:t>Il diabetologo</w:t>
+            </w:r>
+            <w:r>
+              <w:rPr>
+                <w:rFonts w:ascii="Arial" w:eastAsia="Times New Roman" w:hAnsi="Arial" w:cs="Arial"/>
+                <w:lang w:val="it-IT"/>
+              </w:rPr>
+              <w:t xml:space="preserve"> </w:t>
+            </w:r>
+            <w:r>
+              <w:rPr>
+                <w:rFonts w:ascii="Arial" w:eastAsia="Times New Roman" w:hAnsi="Arial" w:cs="Arial"/>
+                <w:lang w:val="it-IT"/>
+              </w:rPr>
+              <w:t>consulta il registro delle modifiche dei dati dei pazienti effettuate</w:t>
             </w:r>
           </w:p>
         </w:tc>
@@ -8230,14 +8089,7 @@
                 <w:rFonts w:ascii="Arial" w:eastAsia="Times New Roman" w:hAnsi="Arial" w:cs="Arial"/>
                 <w:lang w:val="it-IT"/>
               </w:rPr>
-              <w:t xml:space="preserve"> </w:t>
-            </w:r>
-            <w:r>
-              <w:rPr>
-                <w:rFonts w:ascii="Arial" w:eastAsia="Times New Roman" w:hAnsi="Arial" w:cs="Arial"/>
-                <w:lang w:val="it-IT"/>
-              </w:rPr>
-              <w:t>ha effettuato il login</w:t>
+              <w:t xml:space="preserve"> ha effettuato il login</w:t>
             </w:r>
           </w:p>
         </w:tc>
@@ -8305,34 +8157,22 @@
               <w:pStyle w:val="Paragrafoelenco"/>
               <w:numPr>
                 <w:ilvl w:val="0"/>
-                <w:numId w:val="10"/>
+                <w:numId w:val="18"/>
               </w:numPr>
               <w:spacing w:before="210" w:after="210"/>
               <w:rPr>
                 <w:rFonts w:ascii="Arial" w:eastAsia="Times New Roman" w:hAnsi="Arial" w:cs="Arial"/>
-                <w:lang w:val="it-IT"/>
-              </w:rPr>
-            </w:pPr>
-            <w:r>
-              <w:rPr>
-                <w:rFonts w:ascii="Arial" w:eastAsia="Times New Roman" w:hAnsi="Arial" w:cs="Arial"/>
-                <w:lang w:val="it-IT"/>
-              </w:rPr>
-              <w:t>Il diabetologo clicca sul pulsante “</w:t>
-            </w:r>
-            <w:r>
-              <w:rPr>
-                <w:rFonts w:ascii="Arial" w:eastAsia="Times New Roman" w:hAnsi="Arial" w:cs="Arial"/>
-                <w:lang w:val="it-IT"/>
-              </w:rPr>
-              <w:t>Andamento</w:t>
-            </w:r>
-            <w:r>
-              <w:rPr>
-                <w:rFonts w:ascii="Arial" w:eastAsia="Times New Roman" w:hAnsi="Arial" w:cs="Arial"/>
-                <w:lang w:val="it-IT"/>
-              </w:rPr>
-              <w:t>” per un paziente nell’elenco</w:t>
+                <w:color w:val="000000" w:themeColor="text1"/>
+                <w:lang w:val="it-IT"/>
+              </w:rPr>
+            </w:pPr>
+            <w:r>
+              <w:rPr>
+                <w:rFonts w:ascii="Arial" w:eastAsia="Times New Roman" w:hAnsi="Arial" w:cs="Arial"/>
+                <w:color w:val="000000" w:themeColor="text1"/>
+                <w:lang w:val="it-IT"/>
+              </w:rPr>
+              <w:t>Il diabetologo clicca sul pulsante “Apri storico”</w:t>
             </w:r>
           </w:p>
           <w:p>
@@ -8340,7 +8180,7 @@
               <w:pStyle w:val="Paragrafoelenco"/>
               <w:numPr>
                 <w:ilvl w:val="0"/>
-                <w:numId w:val="10"/>
+                <w:numId w:val="18"/>
               </w:numPr>
               <w:spacing w:before="210" w:after="210"/>
               <w:rPr>
@@ -8351,27 +8191,7 @@
             <w:r>
               <w:rPr>
                 <w:rFonts w:ascii="Arial" w:eastAsia="Times New Roman" w:hAnsi="Arial" w:cs="Arial"/>
-                <w:lang w:val="it-IT"/>
-              </w:rPr>
-              <w:t>Il sistema visualizza i dati sull’andamento glicemico</w:t>
-            </w:r>
-          </w:p>
-          <w:p>
-            <w:pPr>
-              <w:pStyle w:val="Paragrafoelenco"/>
-              <w:numPr>
-                <w:ilvl w:val="0"/>
-                <w:numId w:val="10"/>
-              </w:numPr>
-              <w:spacing w:before="210" w:after="210"/>
-              <w:rPr>
-                <w:rFonts w:ascii="Arial" w:eastAsia="Times New Roman" w:hAnsi="Arial" w:cs="Arial"/>
-                <w:lang w:val="it-IT"/>
-              </w:rPr>
-            </w:pPr>
-            <w:r>
-              <w:rPr>
-                <w:rFonts w:ascii="Arial" w:eastAsia="Times New Roman" w:hAnsi="Arial" w:cs="Arial"/>
+                <w:color w:val="000000" w:themeColor="text1"/>
                 <w:lang w:val="it-IT"/>
               </w:rPr>
               <w:t>Il diabetologo consulta i dati</w:t>
@@ -8450,7 +8270,7 @@
                 <w:rFonts w:ascii="Arial" w:eastAsia="Times New Roman" w:hAnsi="Arial" w:cs="Arial"/>
                 <w:lang w:val="it-IT"/>
               </w:rPr>
-              <w:t>Nessuna</w:t>
+              <w:t>Se non è stata effettuata nessuna operazione, il sistema mostra una lista vuota; il diabetologo può ripristinare i dati di un paziente salvati in precedenza</w:t>
             </w:r>
           </w:p>
         </w:tc>
@@ -8534,6 +8354,153 @@
         </w:tc>
       </w:tr>
     </w:tbl>
+    <w:p>
+      <w:pPr>
+        <w:rPr>
+          <w:lang w:val="it-IT"/>
+        </w:rPr>
+      </w:pPr>
+    </w:p>
+    <w:p>
+      <w:pPr>
+        <w:rPr>
+          <w:lang w:val="it-IT"/>
+        </w:rPr>
+      </w:pPr>
+    </w:p>
+    <w:p>
+      <w:pPr>
+        <w:rPr>
+          <w:lang w:val="it-IT"/>
+        </w:rPr>
+      </w:pPr>
+    </w:p>
+    <w:p>
+      <w:pPr>
+        <w:rPr>
+          <w:lang w:val="it-IT"/>
+        </w:rPr>
+      </w:pPr>
+    </w:p>
+    <w:p>
+      <w:pPr>
+        <w:rPr>
+          <w:lang w:val="it-IT"/>
+        </w:rPr>
+      </w:pPr>
+    </w:p>
+    <w:p>
+      <w:pPr>
+        <w:rPr>
+          <w:lang w:val="it-IT"/>
+        </w:rPr>
+      </w:pPr>
+    </w:p>
+    <w:p>
+      <w:pPr>
+        <w:rPr>
+          <w:lang w:val="it-IT"/>
+        </w:rPr>
+      </w:pPr>
+    </w:p>
+    <w:p>
+      <w:pPr>
+        <w:rPr>
+          <w:lang w:val="it-IT"/>
+        </w:rPr>
+      </w:pPr>
+    </w:p>
+    <w:p>
+      <w:pPr>
+        <w:rPr>
+          <w:lang w:val="it-IT"/>
+        </w:rPr>
+      </w:pPr>
+    </w:p>
+    <w:p>
+      <w:pPr>
+        <w:rPr>
+          <w:lang w:val="it-IT"/>
+        </w:rPr>
+      </w:pPr>
+    </w:p>
+    <w:p>
+      <w:pPr>
+        <w:rPr>
+          <w:lang w:val="it-IT"/>
+        </w:rPr>
+      </w:pPr>
+    </w:p>
+    <w:p>
+      <w:pPr>
+        <w:rPr>
+          <w:lang w:val="it-IT"/>
+        </w:rPr>
+      </w:pPr>
+    </w:p>
+    <w:p>
+      <w:pPr>
+        <w:rPr>
+          <w:lang w:val="it-IT"/>
+        </w:rPr>
+      </w:pPr>
+    </w:p>
+    <w:p>
+      <w:pPr>
+        <w:rPr>
+          <w:lang w:val="it-IT"/>
+        </w:rPr>
+      </w:pPr>
+    </w:p>
+    <w:p>
+      <w:pPr>
+        <w:rPr>
+          <w:lang w:val="it-IT"/>
+        </w:rPr>
+      </w:pPr>
+    </w:p>
+    <w:p>
+      <w:pPr>
+        <w:rPr>
+          <w:lang w:val="it-IT"/>
+        </w:rPr>
+      </w:pPr>
+    </w:p>
+    <w:p>
+      <w:pPr>
+        <w:rPr>
+          <w:lang w:val="it-IT"/>
+        </w:rPr>
+      </w:pPr>
+    </w:p>
+    <w:p>
+      <w:pPr>
+        <w:rPr>
+          <w:lang w:val="it-IT"/>
+        </w:rPr>
+      </w:pPr>
+    </w:p>
+    <w:p>
+      <w:pPr>
+        <w:rPr>
+          <w:lang w:val="it-IT"/>
+        </w:rPr>
+      </w:pPr>
+    </w:p>
+    <w:p>
+      <w:pPr>
+        <w:rPr>
+          <w:lang w:val="it-IT"/>
+        </w:rPr>
+      </w:pPr>
+    </w:p>
+    <w:p>
+      <w:pPr>
+        <w:rPr>
+          <w:lang w:val="it-IT"/>
+        </w:rPr>
+      </w:pPr>
+    </w:p>
     <w:p>
       <w:pPr>
         <w:rPr>
@@ -8746,7 +8713,7 @@
                 <w:rFonts w:ascii="Arial" w:eastAsia="Times New Roman" w:hAnsi="Arial" w:cs="Arial"/>
                 <w:lang w:val="it-IT"/>
               </w:rPr>
-              <w:t>AssegnazioneTerapia</w:t>
+              <w:t>VisualizzazioneAndamentoGlicemia</w:t>
             </w:r>
             <w:proofErr w:type="spellEnd"/>
           </w:p>
@@ -8899,14 +8866,7 @@
                 <w:rFonts w:ascii="Arial" w:eastAsia="Times New Roman" w:hAnsi="Arial" w:cs="Arial"/>
                 <w:lang w:val="it-IT"/>
               </w:rPr>
-              <w:t xml:space="preserve">Il diabetologo assegna una </w:t>
-            </w:r>
-            <w:r>
-              <w:rPr>
-                <w:rFonts w:ascii="Arial" w:eastAsia="Times New Roman" w:hAnsi="Arial" w:cs="Arial"/>
-                <w:lang w:val="it-IT"/>
-              </w:rPr>
-              <w:t>terapia a un suo paziente</w:t>
+              <w:t>Il diabetologo visualizza, tramite un grafico, l'andamento della glicemia di un paziente: giorno per giorno, settimana per settimana o mese per mese</w:t>
             </w:r>
           </w:p>
         </w:tc>
@@ -8982,14 +8942,21 @@
                 <w:rFonts w:ascii="Arial" w:eastAsia="Times New Roman" w:hAnsi="Arial" w:cs="Arial"/>
                 <w:lang w:val="it-IT"/>
               </w:rPr>
-              <w:t>Il diabetologo ha effettuato il login; il paziente è registrato nel sistema</w:t>
-            </w:r>
-            <w:r>
-              <w:rPr>
-                <w:rFonts w:ascii="Arial" w:eastAsia="Times New Roman" w:hAnsi="Arial" w:cs="Arial"/>
-                <w:lang w:val="it-IT"/>
-              </w:rPr>
-              <w:t xml:space="preserve"> e assegnato al diabetologo</w:t>
+              <w:t>Il diabetologo</w:t>
+            </w:r>
+            <w:r>
+              <w:rPr>
+                <w:rFonts w:ascii="Arial" w:eastAsia="Times New Roman" w:hAnsi="Arial" w:cs="Arial"/>
+                <w:lang w:val="it-IT"/>
+              </w:rPr>
+              <w:t xml:space="preserve"> </w:t>
+            </w:r>
+            <w:r>
+              <w:rPr>
+                <w:rFonts w:ascii="Arial" w:eastAsia="Times New Roman" w:hAnsi="Arial" w:cs="Arial"/>
+                <w:lang w:val="it-IT"/>
+              </w:rPr>
+              <w:t>ha effettuato il login</w:t>
             </w:r>
           </w:p>
         </w:tc>
@@ -9057,7 +9024,7 @@
               <w:pStyle w:val="Paragrafoelenco"/>
               <w:numPr>
                 <w:ilvl w:val="0"/>
-                <w:numId w:val="11"/>
+                <w:numId w:val="10"/>
               </w:numPr>
               <w:spacing w:before="210" w:after="210"/>
               <w:rPr>
@@ -9070,7 +9037,7 @@
                 <w:rFonts w:ascii="Arial" w:eastAsia="Times New Roman" w:hAnsi="Arial" w:cs="Arial"/>
                 <w:lang w:val="it-IT"/>
               </w:rPr>
-              <w:t>Il diabetologo clicca sul pulsante “Terapia” per un paziente nell’elenco</w:t>
+              <w:t>Il diabetologo clicca sul pulsante “Andamento” per un paziente nell’elenco</w:t>
             </w:r>
           </w:p>
           <w:p>
@@ -9078,7 +9045,7 @@
               <w:pStyle w:val="Paragrafoelenco"/>
               <w:numPr>
                 <w:ilvl w:val="0"/>
-                <w:numId w:val="11"/>
+                <w:numId w:val="10"/>
               </w:numPr>
               <w:spacing w:before="210" w:after="210"/>
               <w:rPr>
@@ -9091,7 +9058,7 @@
                 <w:rFonts w:ascii="Arial" w:eastAsia="Times New Roman" w:hAnsi="Arial" w:cs="Arial"/>
                 <w:lang w:val="it-IT"/>
               </w:rPr>
-              <w:t>Il diabetologo clicca sul pulsante “Aggiungi”</w:t>
+              <w:t>Il sistema visualizza i dati sull’andamento glicemico</w:t>
             </w:r>
           </w:p>
           <w:p>
@@ -9099,7 +9066,7 @@
               <w:pStyle w:val="Paragrafoelenco"/>
               <w:numPr>
                 <w:ilvl w:val="0"/>
-                <w:numId w:val="11"/>
+                <w:numId w:val="10"/>
               </w:numPr>
               <w:spacing w:before="210" w:after="210"/>
               <w:rPr>
@@ -9112,98 +9079,7 @@
                 <w:rFonts w:ascii="Arial" w:eastAsia="Times New Roman" w:hAnsi="Arial" w:cs="Arial"/>
                 <w:lang w:val="it-IT"/>
               </w:rPr>
-              <w:t>Il diabetologo clicca sul pulsante “</w:t>
-            </w:r>
-            <w:r>
-              <w:rPr>
-                <w:rFonts w:ascii="Arial" w:eastAsia="Times New Roman" w:hAnsi="Arial" w:cs="Arial"/>
-                <w:lang w:val="it-IT"/>
-              </w:rPr>
-              <w:t>Nuova</w:t>
-            </w:r>
-            <w:r>
-              <w:rPr>
-                <w:rFonts w:ascii="Arial" w:eastAsia="Times New Roman" w:hAnsi="Arial" w:cs="Arial"/>
-                <w:lang w:val="it-IT"/>
-              </w:rPr>
-              <w:t>”</w:t>
-            </w:r>
-          </w:p>
-          <w:p>
-            <w:pPr>
-              <w:pStyle w:val="Paragrafoelenco"/>
-              <w:numPr>
-                <w:ilvl w:val="0"/>
-                <w:numId w:val="11"/>
-              </w:numPr>
-              <w:spacing w:before="210" w:after="210"/>
-              <w:rPr>
-                <w:rFonts w:ascii="Arial" w:eastAsia="Times New Roman" w:hAnsi="Arial" w:cs="Arial"/>
-                <w:lang w:val="it-IT"/>
-              </w:rPr>
-            </w:pPr>
-            <w:r>
-              <w:rPr>
-                <w:rFonts w:ascii="Arial" w:eastAsia="Times New Roman" w:hAnsi="Arial" w:cs="Arial"/>
-                <w:lang w:val="it-IT"/>
-              </w:rPr>
-              <w:t xml:space="preserve">Il sistema chiede il </w:t>
-            </w:r>
-            <w:r>
-              <w:rPr>
-                <w:rFonts w:ascii="Arial" w:eastAsia="Times New Roman" w:hAnsi="Arial" w:cs="Arial"/>
-                <w:lang w:val="it-IT"/>
-              </w:rPr>
-              <w:t>f</w:t>
-            </w:r>
-            <w:r>
-              <w:rPr>
-                <w:rFonts w:ascii="Arial" w:eastAsia="Times New Roman" w:hAnsi="Arial" w:cs="Arial"/>
-                <w:lang w:val="it-IT"/>
-              </w:rPr>
-              <w:t>armaco, il numero di assunzioni giornaliere, la quantità per assunzione ed eventuali indicazioni aggiuntive</w:t>
-            </w:r>
-          </w:p>
-          <w:p>
-            <w:pPr>
-              <w:pStyle w:val="Paragrafoelenco"/>
-              <w:numPr>
-                <w:ilvl w:val="0"/>
-                <w:numId w:val="11"/>
-              </w:numPr>
-              <w:spacing w:before="210" w:after="210"/>
-              <w:rPr>
-                <w:rFonts w:ascii="Arial" w:eastAsia="Times New Roman" w:hAnsi="Arial" w:cs="Arial"/>
-                <w:lang w:val="it-IT"/>
-              </w:rPr>
-            </w:pPr>
-            <w:r>
-              <w:rPr>
-                <w:rFonts w:ascii="Arial" w:eastAsia="Times New Roman" w:hAnsi="Arial" w:cs="Arial"/>
-                <w:lang w:val="it-IT"/>
-              </w:rPr>
-              <w:t>Il diabetologo inserisce i dati richiesti</w:t>
-            </w:r>
-          </w:p>
-          <w:p>
-            <w:pPr>
-              <w:pStyle w:val="Paragrafoelenco"/>
-              <w:numPr>
-                <w:ilvl w:val="0"/>
-                <w:numId w:val="11"/>
-              </w:numPr>
-              <w:spacing w:before="210" w:after="210"/>
-              <w:rPr>
-                <w:rFonts w:ascii="Arial" w:eastAsia="Times New Roman" w:hAnsi="Arial" w:cs="Arial"/>
-                <w:lang w:val="it-IT"/>
-              </w:rPr>
-            </w:pPr>
-            <w:r>
-              <w:rPr>
-                <w:rFonts w:ascii="Arial" w:eastAsia="Times New Roman" w:hAnsi="Arial" w:cs="Arial"/>
-                <w:lang w:val="it-IT"/>
-              </w:rPr>
-              <w:t>Il diabetologo clicca sul pulsante “Salva”</w:t>
+              <w:t>Il diabetologo consulta i dati</w:t>
             </w:r>
           </w:p>
         </w:tc>
@@ -9271,16 +9147,15 @@
               <w:spacing w:before="210" w:after="210"/>
               <w:rPr>
                 <w:rFonts w:ascii="Arial" w:eastAsia="Times New Roman" w:hAnsi="Arial" w:cs="Arial"/>
-                <w:u w:val="single"/>
-                <w:lang w:val="it-IT"/>
-              </w:rPr>
-            </w:pPr>
-            <w:r>
-              <w:rPr>
-                <w:rFonts w:ascii="Arial" w:eastAsia="Times New Roman" w:hAnsi="Arial" w:cs="Arial"/>
-                <w:lang w:val="it-IT"/>
-              </w:rPr>
-              <w:t>Il diabetologo clicca sul pulsante “Esistente” e assegna una terapia già assegnata in passato</w:t>
+                <w:lang w:val="it-IT"/>
+              </w:rPr>
+            </w:pPr>
+            <w:r>
+              <w:rPr>
+                <w:rFonts w:ascii="Arial" w:eastAsia="Times New Roman" w:hAnsi="Arial" w:cs="Arial"/>
+                <w:lang w:val="it-IT"/>
+              </w:rPr>
+              <w:t>Nessuna</w:t>
             </w:r>
           </w:p>
         </w:tc>
@@ -9358,7 +9233,7 @@
                 <w:rFonts w:ascii="Arial" w:eastAsia="Times New Roman" w:hAnsi="Arial" w:cs="Arial"/>
                 <w:lang w:val="it-IT"/>
               </w:rPr>
-              <w:t>La nuova terapia è salvata, attiva e visualizzabile dal paziente; la terapia viene salvata dal sistema</w:t>
+              <w:t>Nessuna</w:t>
             </w:r>
           </w:p>
         </w:tc>
@@ -9521,6 +9396,7 @@
                 <w:bCs/>
                 <w:lang w:val="it-IT"/>
               </w:rPr>
+              <w:lastRenderedPageBreak/>
               <w:t>ID</w:t>
             </w:r>
           </w:p>
@@ -9632,7 +9508,7 @@
                 <w:rFonts w:ascii="Arial" w:eastAsia="Times New Roman" w:hAnsi="Arial" w:cs="Arial"/>
                 <w:lang w:val="it-IT"/>
               </w:rPr>
-              <w:t>ModificaTerapia</w:t>
+              <w:t>AssegnazioneTerapia</w:t>
             </w:r>
             <w:proofErr w:type="spellEnd"/>
           </w:p>
@@ -9785,7 +9661,14 @@
                 <w:rFonts w:ascii="Arial" w:eastAsia="Times New Roman" w:hAnsi="Arial" w:cs="Arial"/>
                 <w:lang w:val="it-IT"/>
               </w:rPr>
-              <w:t>Il diabetologo modifica la terapia esistente di un suo paziente</w:t>
+              <w:t xml:space="preserve">Il diabetologo assegna una </w:t>
+            </w:r>
+            <w:r>
+              <w:rPr>
+                <w:rFonts w:ascii="Arial" w:eastAsia="Times New Roman" w:hAnsi="Arial" w:cs="Arial"/>
+                <w:lang w:val="it-IT"/>
+              </w:rPr>
+              <w:t>terapia a un suo paziente</w:t>
             </w:r>
           </w:p>
         </w:tc>
@@ -9861,7 +9744,14 @@
                 <w:rFonts w:ascii="Arial" w:eastAsia="Times New Roman" w:hAnsi="Arial" w:cs="Arial"/>
                 <w:lang w:val="it-IT"/>
               </w:rPr>
-              <w:t>Il diabetologo ha effettuato il login; al paziente è già associata una terapia</w:t>
+              <w:t>Il diabetologo ha effettuato il login; il paziente è registrato nel sistema</w:t>
+            </w:r>
+            <w:r>
+              <w:rPr>
+                <w:rFonts w:ascii="Arial" w:eastAsia="Times New Roman" w:hAnsi="Arial" w:cs="Arial"/>
+                <w:lang w:val="it-IT"/>
+              </w:rPr>
+              <w:t xml:space="preserve"> e assegnato al diabetologo</w:t>
             </w:r>
           </w:p>
         </w:tc>
@@ -9929,7 +9819,7 @@
               <w:pStyle w:val="Paragrafoelenco"/>
               <w:numPr>
                 <w:ilvl w:val="0"/>
-                <w:numId w:val="13"/>
+                <w:numId w:val="11"/>
               </w:numPr>
               <w:spacing w:before="210" w:after="210"/>
               <w:rPr>
@@ -9950,7 +9840,7 @@
               <w:pStyle w:val="Paragrafoelenco"/>
               <w:numPr>
                 <w:ilvl w:val="0"/>
-                <w:numId w:val="13"/>
+                <w:numId w:val="11"/>
               </w:numPr>
               <w:spacing w:before="210" w:after="210"/>
               <w:rPr>
@@ -9963,7 +9853,7 @@
                 <w:rFonts w:ascii="Arial" w:eastAsia="Times New Roman" w:hAnsi="Arial" w:cs="Arial"/>
                 <w:lang w:val="it-IT"/>
               </w:rPr>
-              <w:t>Il diabetologo clicca sul pulsante “Modifica” relativo a una terapia</w:t>
+              <w:t>Il diabetologo clicca sul pulsante “Aggiungi”</w:t>
             </w:r>
           </w:p>
           <w:p>
@@ -9971,7 +9861,7 @@
               <w:pStyle w:val="Paragrafoelenco"/>
               <w:numPr>
                 <w:ilvl w:val="0"/>
-                <w:numId w:val="13"/>
+                <w:numId w:val="11"/>
               </w:numPr>
               <w:spacing w:before="210" w:after="210"/>
               <w:rPr>
@@ -9984,7 +9874,7 @@
                 <w:rFonts w:ascii="Arial" w:eastAsia="Times New Roman" w:hAnsi="Arial" w:cs="Arial"/>
                 <w:lang w:val="it-IT"/>
               </w:rPr>
-              <w:t>Il sistema permette di modificare il farmaco, il numero di assunzioni giornaliere, la quantità per assunzione ed eventuali indicazioni aggiuntive</w:t>
+              <w:t>Il diabetologo clicca sul pulsante “Nuova”</w:t>
             </w:r>
           </w:p>
           <w:p>
@@ -9992,7 +9882,7 @@
               <w:pStyle w:val="Paragrafoelenco"/>
               <w:numPr>
                 <w:ilvl w:val="0"/>
-                <w:numId w:val="13"/>
+                <w:numId w:val="11"/>
               </w:numPr>
               <w:spacing w:before="210" w:after="210"/>
               <w:rPr>
@@ -10005,7 +9895,21 @@
                 <w:rFonts w:ascii="Arial" w:eastAsia="Times New Roman" w:hAnsi="Arial" w:cs="Arial"/>
                 <w:lang w:val="it-IT"/>
               </w:rPr>
-              <w:t>Il diabetologo modifica i dati necessari</w:t>
+              <w:t xml:space="preserve">Il sistema chiede il </w:t>
+            </w:r>
+            <w:r>
+              <w:rPr>
+                <w:rFonts w:ascii="Arial" w:eastAsia="Times New Roman" w:hAnsi="Arial" w:cs="Arial"/>
+                <w:lang w:val="it-IT"/>
+              </w:rPr>
+              <w:t>f</w:t>
+            </w:r>
+            <w:r>
+              <w:rPr>
+                <w:rFonts w:ascii="Arial" w:eastAsia="Times New Roman" w:hAnsi="Arial" w:cs="Arial"/>
+                <w:lang w:val="it-IT"/>
+              </w:rPr>
+              <w:t>armaco, il numero di assunzioni giornaliere, la quantità per assunzione ed eventuali indicazioni aggiuntive</w:t>
             </w:r>
           </w:p>
           <w:p>
@@ -10013,7 +9917,7 @@
               <w:pStyle w:val="Paragrafoelenco"/>
               <w:numPr>
                 <w:ilvl w:val="0"/>
-                <w:numId w:val="13"/>
+                <w:numId w:val="11"/>
               </w:numPr>
               <w:spacing w:before="210" w:after="210"/>
               <w:rPr>
@@ -10026,7 +9930,7 @@
                 <w:rFonts w:ascii="Arial" w:eastAsia="Times New Roman" w:hAnsi="Arial" w:cs="Arial"/>
                 <w:lang w:val="it-IT"/>
               </w:rPr>
-              <w:t>Il diabetologo clicca sul pulsante “Salva”</w:t>
+              <w:t>Il diabetologo inserisce i dati richiesti</w:t>
             </w:r>
           </w:p>
           <w:p>
@@ -10034,7 +9938,7 @@
               <w:pStyle w:val="Paragrafoelenco"/>
               <w:numPr>
                 <w:ilvl w:val="0"/>
-                <w:numId w:val="13"/>
+                <w:numId w:val="11"/>
               </w:numPr>
               <w:spacing w:before="210" w:after="210"/>
               <w:rPr>
@@ -10047,7 +9951,7 @@
                 <w:rFonts w:ascii="Arial" w:eastAsia="Times New Roman" w:hAnsi="Arial" w:cs="Arial"/>
                 <w:lang w:val="it-IT"/>
               </w:rPr>
-              <w:t>Il sistema aggiorna la terapia</w:t>
+              <w:t>Il diabetologo clicca sul pulsante “Salva”</w:t>
             </w:r>
           </w:p>
         </w:tc>
@@ -10115,15 +10019,16 @@
               <w:spacing w:before="210" w:after="210"/>
               <w:rPr>
                 <w:rFonts w:ascii="Arial" w:eastAsia="Times New Roman" w:hAnsi="Arial" w:cs="Arial"/>
-                <w:lang w:val="it-IT"/>
-              </w:rPr>
-            </w:pPr>
-            <w:r>
-              <w:rPr>
-                <w:rFonts w:ascii="Arial" w:eastAsia="Times New Roman" w:hAnsi="Arial" w:cs="Arial"/>
-                <w:lang w:val="it-IT"/>
-              </w:rPr>
-              <w:t>Se il diabetologo non modifica nessun dato, la terapia non viene aggiornata</w:t>
+                <w:u w:val="single"/>
+                <w:lang w:val="it-IT"/>
+              </w:rPr>
+            </w:pPr>
+            <w:r>
+              <w:rPr>
+                <w:rFonts w:ascii="Arial" w:eastAsia="Times New Roman" w:hAnsi="Arial" w:cs="Arial"/>
+                <w:lang w:val="it-IT"/>
+              </w:rPr>
+              <w:t>Il diabetologo clicca sul pulsante “Esistente” e assegna una terapia già assegnata in passato</w:t>
             </w:r>
           </w:p>
         </w:tc>
@@ -10201,103 +10106,12 @@
                 <w:rFonts w:ascii="Arial" w:eastAsia="Times New Roman" w:hAnsi="Arial" w:cs="Arial"/>
                 <w:lang w:val="it-IT"/>
               </w:rPr>
-              <w:t>La terapia è</w:t>
-            </w:r>
-            <w:r>
-              <w:rPr>
-                <w:rFonts w:ascii="Arial" w:eastAsia="Times New Roman" w:hAnsi="Arial" w:cs="Arial"/>
-                <w:lang w:val="it-IT"/>
-              </w:rPr>
-              <w:t xml:space="preserve"> attiva e visualizzabile dal paziente</w:t>
-            </w:r>
-            <w:r>
-              <w:rPr>
-                <w:rFonts w:ascii="Arial" w:eastAsia="Times New Roman" w:hAnsi="Arial" w:cs="Arial"/>
-                <w:lang w:val="it-IT"/>
-              </w:rPr>
-              <w:t>; è salvata dal sistema se nuova</w:t>
+              <w:t>La nuova terapia è salvata, attiva e visualizzabile dal paziente; la terapia viene salvata dal sistema</w:t>
             </w:r>
           </w:p>
         </w:tc>
       </w:tr>
     </w:tbl>
-    <w:p>
-      <w:pPr>
-        <w:rPr>
-          <w:lang w:val="it-IT"/>
-        </w:rPr>
-      </w:pPr>
-    </w:p>
-    <w:p>
-      <w:pPr>
-        <w:rPr>
-          <w:lang w:val="it-IT"/>
-        </w:rPr>
-      </w:pPr>
-    </w:p>
-    <w:p>
-      <w:pPr>
-        <w:rPr>
-          <w:lang w:val="it-IT"/>
-        </w:rPr>
-      </w:pPr>
-    </w:p>
-    <w:p>
-      <w:pPr>
-        <w:rPr>
-          <w:lang w:val="it-IT"/>
-        </w:rPr>
-      </w:pPr>
-    </w:p>
-    <w:p>
-      <w:pPr>
-        <w:rPr>
-          <w:lang w:val="it-IT"/>
-        </w:rPr>
-      </w:pPr>
-    </w:p>
-    <w:p>
-      <w:pPr>
-        <w:rPr>
-          <w:lang w:val="it-IT"/>
-        </w:rPr>
-      </w:pPr>
-    </w:p>
-    <w:p>
-      <w:pPr>
-        <w:rPr>
-          <w:lang w:val="it-IT"/>
-        </w:rPr>
-      </w:pPr>
-    </w:p>
-    <w:p>
-      <w:pPr>
-        <w:rPr>
-          <w:lang w:val="it-IT"/>
-        </w:rPr>
-      </w:pPr>
-    </w:p>
-    <w:p>
-      <w:pPr>
-        <w:rPr>
-          <w:lang w:val="it-IT"/>
-        </w:rPr>
-      </w:pPr>
-    </w:p>
-    <w:p>
-      <w:pPr>
-        <w:rPr>
-          <w:lang w:val="it-IT"/>
-        </w:rPr>
-      </w:pPr>
-    </w:p>
-    <w:p>
-      <w:pPr>
-        <w:rPr>
-          <w:lang w:val="it-IT"/>
-        </w:rPr>
-      </w:pPr>
-    </w:p>
     <w:p>
       <w:pPr>
         <w:rPr>
@@ -10566,7 +10380,7 @@
                 <w:rFonts w:ascii="Arial" w:eastAsia="Times New Roman" w:hAnsi="Arial" w:cs="Arial"/>
                 <w:lang w:val="it-IT"/>
               </w:rPr>
-              <w:t>CreazioneNuovoUtente</w:t>
+              <w:t>ModificaTerapia</w:t>
             </w:r>
             <w:proofErr w:type="spellEnd"/>
           </w:p>
@@ -10643,7 +10457,7 @@
                 <w:rFonts w:ascii="Arial" w:eastAsia="Times New Roman" w:hAnsi="Arial" w:cs="Arial"/>
                 <w:lang w:val="it-IT"/>
               </w:rPr>
-              <w:t>Amministratore</w:t>
+              <w:t>Diabetologo</w:t>
             </w:r>
           </w:p>
         </w:tc>
@@ -10719,7 +10533,7 @@
                 <w:rFonts w:ascii="Arial" w:eastAsia="Times New Roman" w:hAnsi="Arial" w:cs="Arial"/>
                 <w:lang w:val="it-IT"/>
               </w:rPr>
-              <w:t>L’amministratore crea un nuovo account utente (paziente o diabetologo) nel sistema</w:t>
+              <w:t>Il diabetologo modifica la terapia esistente di un suo paziente</w:t>
             </w:r>
           </w:p>
         </w:tc>
@@ -10795,7 +10609,7 @@
                 <w:rFonts w:ascii="Arial" w:eastAsia="Times New Roman" w:hAnsi="Arial" w:cs="Arial"/>
                 <w:lang w:val="it-IT"/>
               </w:rPr>
-              <w:t>L’amministratore ha effettuato il login</w:t>
+              <w:t>Il diabetologo ha effettuato il login; al paziente è già associata una terapia</w:t>
             </w:r>
           </w:p>
         </w:tc>
@@ -10863,7 +10677,7 @@
               <w:pStyle w:val="Paragrafoelenco"/>
               <w:numPr>
                 <w:ilvl w:val="0"/>
-                <w:numId w:val="14"/>
+                <w:numId w:val="13"/>
               </w:numPr>
               <w:spacing w:before="210" w:after="210"/>
               <w:rPr>
@@ -10876,7 +10690,7 @@
                 <w:rFonts w:ascii="Arial" w:eastAsia="Times New Roman" w:hAnsi="Arial" w:cs="Arial"/>
                 <w:lang w:val="it-IT"/>
               </w:rPr>
-              <w:t>L’amministratore clicca sul pulsante “Aggiungi medici”/”Aggiungi pazienti”</w:t>
+              <w:t>Il diabetologo clicca sul pulsante “Terapia” per un paziente nell’elenco</w:t>
             </w:r>
           </w:p>
           <w:p>
@@ -10884,7 +10698,7 @@
               <w:pStyle w:val="Paragrafoelenco"/>
               <w:numPr>
                 <w:ilvl w:val="0"/>
-                <w:numId w:val="14"/>
+                <w:numId w:val="13"/>
               </w:numPr>
               <w:spacing w:before="210" w:after="210"/>
               <w:rPr>
@@ -10897,7 +10711,7 @@
                 <w:rFonts w:ascii="Arial" w:eastAsia="Times New Roman" w:hAnsi="Arial" w:cs="Arial"/>
                 <w:lang w:val="it-IT"/>
               </w:rPr>
-              <w:t>Il sistema chiede di inserire nome, cognome, codice fiscale, email, username e password</w:t>
+              <w:t>Il diabetologo clicca sul pulsante “Modifica” relativo a una terapia</w:t>
             </w:r>
           </w:p>
           <w:p>
@@ -10905,7 +10719,7 @@
               <w:pStyle w:val="Paragrafoelenco"/>
               <w:numPr>
                 <w:ilvl w:val="0"/>
-                <w:numId w:val="14"/>
+                <w:numId w:val="13"/>
               </w:numPr>
               <w:spacing w:before="210" w:after="210"/>
               <w:rPr>
@@ -10918,7 +10732,7 @@
                 <w:rFonts w:ascii="Arial" w:eastAsia="Times New Roman" w:hAnsi="Arial" w:cs="Arial"/>
                 <w:lang w:val="it-IT"/>
               </w:rPr>
-              <w:t>L’amministratore inserisce i dati</w:t>
+              <w:t>Il sistema permette di modificare il farmaco, il numero di assunzioni giornaliere, la quantità per assunzione ed eventuali indicazioni aggiuntive</w:t>
             </w:r>
           </w:p>
           <w:p>
@@ -10926,7 +10740,7 @@
               <w:pStyle w:val="Paragrafoelenco"/>
               <w:numPr>
                 <w:ilvl w:val="0"/>
-                <w:numId w:val="14"/>
+                <w:numId w:val="13"/>
               </w:numPr>
               <w:spacing w:before="210" w:after="210"/>
               <w:rPr>
@@ -10939,7 +10753,49 @@
                 <w:rFonts w:ascii="Arial" w:eastAsia="Times New Roman" w:hAnsi="Arial" w:cs="Arial"/>
                 <w:lang w:val="it-IT"/>
               </w:rPr>
-              <w:t>L’amministratore clicca sul pulsante “Conferma”</w:t>
+              <w:t>Il diabetologo modifica i dati necessari</w:t>
+            </w:r>
+          </w:p>
+          <w:p>
+            <w:pPr>
+              <w:pStyle w:val="Paragrafoelenco"/>
+              <w:numPr>
+                <w:ilvl w:val="0"/>
+                <w:numId w:val="13"/>
+              </w:numPr>
+              <w:spacing w:before="210" w:after="210"/>
+              <w:rPr>
+                <w:rFonts w:ascii="Arial" w:eastAsia="Times New Roman" w:hAnsi="Arial" w:cs="Arial"/>
+                <w:lang w:val="it-IT"/>
+              </w:rPr>
+            </w:pPr>
+            <w:r>
+              <w:rPr>
+                <w:rFonts w:ascii="Arial" w:eastAsia="Times New Roman" w:hAnsi="Arial" w:cs="Arial"/>
+                <w:lang w:val="it-IT"/>
+              </w:rPr>
+              <w:t>Il diabetologo clicca sul pulsante “Salva”</w:t>
+            </w:r>
+          </w:p>
+          <w:p>
+            <w:pPr>
+              <w:pStyle w:val="Paragrafoelenco"/>
+              <w:numPr>
+                <w:ilvl w:val="0"/>
+                <w:numId w:val="13"/>
+              </w:numPr>
+              <w:spacing w:before="210" w:after="210"/>
+              <w:rPr>
+                <w:rFonts w:ascii="Arial" w:eastAsia="Times New Roman" w:hAnsi="Arial" w:cs="Arial"/>
+                <w:lang w:val="it-IT"/>
+              </w:rPr>
+            </w:pPr>
+            <w:r>
+              <w:rPr>
+                <w:rFonts w:ascii="Arial" w:eastAsia="Times New Roman" w:hAnsi="Arial" w:cs="Arial"/>
+                <w:lang w:val="it-IT"/>
+              </w:rPr>
+              <w:t>Il sistema aggiorna la terapia</w:t>
             </w:r>
           </w:p>
         </w:tc>
@@ -11015,7 +10871,7 @@
                 <w:rFonts w:ascii="Arial" w:eastAsia="Times New Roman" w:hAnsi="Arial" w:cs="Arial"/>
                 <w:lang w:val="it-IT"/>
               </w:rPr>
-              <w:t>Se esiste un altro utente con lo stesso username, viene mostrato un messaggio di errore e si ritorna al passo 3</w:t>
+              <w:t>Se il diabetologo non modifica nessun dato, la terapia non viene aggiornata</w:t>
             </w:r>
           </w:p>
         </w:tc>
@@ -11093,12 +10949,159 @@
                 <w:rFonts w:ascii="Arial" w:eastAsia="Times New Roman" w:hAnsi="Arial" w:cs="Arial"/>
                 <w:lang w:val="it-IT"/>
               </w:rPr>
-              <w:t>Il nuovo utente viene creato ed è abilitato all’accesso</w:t>
+              <w:t>La terapia è attiva e visualizzabile dal paziente; è salvata dal sistema se nuova</w:t>
             </w:r>
           </w:p>
         </w:tc>
       </w:tr>
     </w:tbl>
+    <w:p>
+      <w:pPr>
+        <w:rPr>
+          <w:lang w:val="it-IT"/>
+        </w:rPr>
+      </w:pPr>
+    </w:p>
+    <w:p>
+      <w:pPr>
+        <w:rPr>
+          <w:lang w:val="it-IT"/>
+        </w:rPr>
+      </w:pPr>
+    </w:p>
+    <w:p>
+      <w:pPr>
+        <w:rPr>
+          <w:lang w:val="it-IT"/>
+        </w:rPr>
+      </w:pPr>
+    </w:p>
+    <w:p>
+      <w:pPr>
+        <w:rPr>
+          <w:lang w:val="it-IT"/>
+        </w:rPr>
+      </w:pPr>
+    </w:p>
+    <w:p>
+      <w:pPr>
+        <w:rPr>
+          <w:lang w:val="it-IT"/>
+        </w:rPr>
+      </w:pPr>
+    </w:p>
+    <w:p>
+      <w:pPr>
+        <w:rPr>
+          <w:lang w:val="it-IT"/>
+        </w:rPr>
+      </w:pPr>
+    </w:p>
+    <w:p>
+      <w:pPr>
+        <w:rPr>
+          <w:lang w:val="it-IT"/>
+        </w:rPr>
+      </w:pPr>
+    </w:p>
+    <w:p>
+      <w:pPr>
+        <w:rPr>
+          <w:lang w:val="it-IT"/>
+        </w:rPr>
+      </w:pPr>
+    </w:p>
+    <w:p>
+      <w:pPr>
+        <w:rPr>
+          <w:lang w:val="it-IT"/>
+        </w:rPr>
+      </w:pPr>
+    </w:p>
+    <w:p>
+      <w:pPr>
+        <w:rPr>
+          <w:lang w:val="it-IT"/>
+        </w:rPr>
+      </w:pPr>
+    </w:p>
+    <w:p>
+      <w:pPr>
+        <w:rPr>
+          <w:lang w:val="it-IT"/>
+        </w:rPr>
+      </w:pPr>
+    </w:p>
+    <w:p>
+      <w:pPr>
+        <w:rPr>
+          <w:lang w:val="it-IT"/>
+        </w:rPr>
+      </w:pPr>
+    </w:p>
+    <w:p>
+      <w:pPr>
+        <w:rPr>
+          <w:lang w:val="it-IT"/>
+        </w:rPr>
+      </w:pPr>
+    </w:p>
+    <w:p>
+      <w:pPr>
+        <w:rPr>
+          <w:lang w:val="it-IT"/>
+        </w:rPr>
+      </w:pPr>
+    </w:p>
+    <w:p>
+      <w:pPr>
+        <w:rPr>
+          <w:lang w:val="it-IT"/>
+        </w:rPr>
+      </w:pPr>
+    </w:p>
+    <w:p>
+      <w:pPr>
+        <w:rPr>
+          <w:lang w:val="it-IT"/>
+        </w:rPr>
+      </w:pPr>
+    </w:p>
+    <w:p>
+      <w:pPr>
+        <w:rPr>
+          <w:lang w:val="it-IT"/>
+        </w:rPr>
+      </w:pPr>
+    </w:p>
+    <w:p>
+      <w:pPr>
+        <w:rPr>
+          <w:lang w:val="it-IT"/>
+        </w:rPr>
+      </w:pPr>
+    </w:p>
+    <w:p>
+      <w:pPr>
+        <w:rPr>
+          <w:lang w:val="it-IT"/>
+        </w:rPr>
+      </w:pPr>
+    </w:p>
+    <w:p>
+      <w:pPr>
+        <w:rPr>
+          <w:lang w:val="it-IT"/>
+        </w:rPr>
+      </w:pPr>
+    </w:p>
+    <w:p>
+      <w:pPr>
+        <w:rPr>
+          <w:lang w:val="it-IT"/>
+        </w:rPr>
+      </w:pPr>
+    </w:p>
     <w:p>
       <w:pPr>
         <w:rPr>
@@ -11212,16 +11215,15 @@
               <w:spacing w:before="210" w:after="210"/>
               <w:rPr>
                 <w:rFonts w:ascii="Arial" w:eastAsia="Times New Roman" w:hAnsi="Arial" w:cs="Arial"/>
-                <w:u w:val="single"/>
-                <w:lang w:val="it-IT"/>
-              </w:rPr>
-            </w:pPr>
-            <w:r>
-              <w:rPr>
-                <w:rFonts w:ascii="Arial" w:eastAsia="Times New Roman" w:hAnsi="Arial" w:cs="Arial"/>
-                <w:lang w:val="it-IT"/>
-              </w:rPr>
-              <w:t>12a</w:t>
+                <w:lang w:val="it-IT"/>
+              </w:rPr>
+            </w:pPr>
+            <w:r>
+              <w:rPr>
+                <w:rFonts w:ascii="Arial" w:eastAsia="Times New Roman" w:hAnsi="Arial" w:cs="Arial"/>
+                <w:lang w:val="it-IT"/>
+              </w:rPr>
+              <w:t>13</w:t>
             </w:r>
           </w:p>
         </w:tc>
@@ -11298,7 +11300,7 @@
                 <w:rFonts w:ascii="Arial" w:eastAsia="Times New Roman" w:hAnsi="Arial" w:cs="Arial"/>
                 <w:lang w:val="it-IT"/>
               </w:rPr>
-              <w:t>AssegnaMedicoDiRiferimento</w:t>
+              <w:t>CreazioneNuovoUtente</w:t>
             </w:r>
             <w:proofErr w:type="spellEnd"/>
           </w:p>
@@ -11375,21 +11377,7 @@
                 <w:rFonts w:ascii="Arial" w:eastAsia="Times New Roman" w:hAnsi="Arial" w:cs="Arial"/>
                 <w:lang w:val="it-IT"/>
               </w:rPr>
-              <w:t>Ammin</w:t>
-            </w:r>
-            <w:r>
-              <w:rPr>
-                <w:rFonts w:ascii="Arial" w:eastAsia="Times New Roman" w:hAnsi="Arial" w:cs="Arial"/>
-                <w:lang w:val="it-IT"/>
-              </w:rPr>
-              <w:t>i</w:t>
-            </w:r>
-            <w:r>
-              <w:rPr>
-                <w:rFonts w:ascii="Arial" w:eastAsia="Times New Roman" w:hAnsi="Arial" w:cs="Arial"/>
-                <w:lang w:val="it-IT"/>
-              </w:rPr>
-              <w:t>stratore</w:t>
+              <w:t>Amministratore</w:t>
             </w:r>
           </w:p>
         </w:tc>
@@ -11465,28 +11453,7 @@
                 <w:rFonts w:ascii="Arial" w:eastAsia="Times New Roman" w:hAnsi="Arial" w:cs="Arial"/>
                 <w:lang w:val="it-IT"/>
               </w:rPr>
-              <w:t>L'amministratore associa</w:t>
-            </w:r>
-            <w:r>
-              <w:rPr>
-                <w:rFonts w:ascii="Arial" w:eastAsia="Times New Roman" w:hAnsi="Arial" w:cs="Arial"/>
-                <w:lang w:val="it-IT"/>
-              </w:rPr>
-              <w:t xml:space="preserve"> al paziente</w:t>
-            </w:r>
-            <w:r>
-              <w:rPr>
-                <w:rFonts w:ascii="Arial" w:eastAsia="Times New Roman" w:hAnsi="Arial" w:cs="Arial"/>
-                <w:lang w:val="it-IT"/>
-              </w:rPr>
-              <w:t xml:space="preserve"> un diabeto</w:t>
-            </w:r>
-            <w:r>
-              <w:rPr>
-                <w:rFonts w:ascii="Arial" w:eastAsia="Times New Roman" w:hAnsi="Arial" w:cs="Arial"/>
-                <w:lang w:val="it-IT"/>
-              </w:rPr>
-              <w:t>logo come medico di riferimento</w:t>
+              <w:t>L’amministratore crea un nuovo account utente (paziente o diabetologo) nel sistema</w:t>
             </w:r>
           </w:p>
         </w:tc>
@@ -11562,14 +11529,7 @@
                 <w:rFonts w:ascii="Arial" w:eastAsia="Times New Roman" w:hAnsi="Arial" w:cs="Arial"/>
                 <w:lang w:val="it-IT"/>
               </w:rPr>
-              <w:t>È</w:t>
-            </w:r>
-            <w:r>
-              <w:rPr>
-                <w:rFonts w:ascii="Arial" w:eastAsia="Times New Roman" w:hAnsi="Arial" w:cs="Arial"/>
-                <w:lang w:val="it-IT"/>
-              </w:rPr>
-              <w:t xml:space="preserve"> in corso la creazione o modifica di un account paziente</w:t>
+              <w:t>L’amministratore ha effettuato il login</w:t>
             </w:r>
           </w:p>
         </w:tc>
@@ -11637,7 +11597,7 @@
               <w:pStyle w:val="Paragrafoelenco"/>
               <w:numPr>
                 <w:ilvl w:val="0"/>
-                <w:numId w:val="15"/>
+                <w:numId w:val="14"/>
               </w:numPr>
               <w:spacing w:before="210" w:after="210"/>
               <w:rPr>
@@ -11650,23 +11610,7 @@
                 <w:rFonts w:ascii="Arial" w:eastAsia="Times New Roman" w:hAnsi="Arial" w:cs="Arial"/>
                 <w:lang w:val="it-IT"/>
               </w:rPr>
-              <w:t>Include (</w:t>
-            </w:r>
-            <w:proofErr w:type="spellStart"/>
-            <w:r>
-              <w:rPr>
-                <w:rFonts w:ascii="Arial" w:eastAsia="Times New Roman" w:hAnsi="Arial" w:cs="Arial"/>
-                <w:lang w:val="it-IT"/>
-              </w:rPr>
-              <w:t>CreazioneNuovoUtente</w:t>
-            </w:r>
-            <w:proofErr w:type="spellEnd"/>
-            <w:r>
-              <w:rPr>
-                <w:rFonts w:ascii="Arial" w:eastAsia="Times New Roman" w:hAnsi="Arial" w:cs="Arial"/>
-                <w:lang w:val="it-IT"/>
-              </w:rPr>
-              <w:t>)</w:t>
+              <w:t>L’amministratore clicca sul pulsante “Aggiungi medici”/”Aggiungi pazienti”</w:t>
             </w:r>
           </w:p>
           <w:p>
@@ -11674,7 +11618,7 @@
               <w:pStyle w:val="Paragrafoelenco"/>
               <w:numPr>
                 <w:ilvl w:val="0"/>
-                <w:numId w:val="15"/>
+                <w:numId w:val="14"/>
               </w:numPr>
               <w:spacing w:before="210" w:after="210"/>
               <w:rPr>
@@ -11687,7 +11631,7 @@
                 <w:rFonts w:ascii="Arial" w:eastAsia="Times New Roman" w:hAnsi="Arial" w:cs="Arial"/>
                 <w:lang w:val="it-IT"/>
               </w:rPr>
-              <w:t>Il sistema mostra l’elenco dei diabetologi</w:t>
+              <w:t>Il sistema chiede di inserire nome, cognome, codice fiscale, email, username e password</w:t>
             </w:r>
           </w:p>
           <w:p>
@@ -11695,7 +11639,7 @@
               <w:pStyle w:val="Paragrafoelenco"/>
               <w:numPr>
                 <w:ilvl w:val="0"/>
-                <w:numId w:val="15"/>
+                <w:numId w:val="14"/>
               </w:numPr>
               <w:spacing w:before="210" w:after="210"/>
               <w:rPr>
@@ -11708,7 +11652,28 @@
                 <w:rFonts w:ascii="Arial" w:eastAsia="Times New Roman" w:hAnsi="Arial" w:cs="Arial"/>
                 <w:lang w:val="it-IT"/>
               </w:rPr>
-              <w:t>L’amministratore seleziona il diabetologo di riferimento</w:t>
+              <w:t>L’amministratore inserisce i dati</w:t>
+            </w:r>
+          </w:p>
+          <w:p>
+            <w:pPr>
+              <w:pStyle w:val="Paragrafoelenco"/>
+              <w:numPr>
+                <w:ilvl w:val="0"/>
+                <w:numId w:val="14"/>
+              </w:numPr>
+              <w:spacing w:before="210" w:after="210"/>
+              <w:rPr>
+                <w:rFonts w:ascii="Arial" w:eastAsia="Times New Roman" w:hAnsi="Arial" w:cs="Arial"/>
+                <w:lang w:val="it-IT"/>
+              </w:rPr>
+            </w:pPr>
+            <w:r>
+              <w:rPr>
+                <w:rFonts w:ascii="Arial" w:eastAsia="Times New Roman" w:hAnsi="Arial" w:cs="Arial"/>
+                <w:lang w:val="it-IT"/>
+              </w:rPr>
+              <w:t>L’amministratore clicca sul pulsante “Conferma”</w:t>
             </w:r>
           </w:p>
         </w:tc>
@@ -11784,7 +11749,7 @@
                 <w:rFonts w:ascii="Arial" w:eastAsia="Times New Roman" w:hAnsi="Arial" w:cs="Arial"/>
                 <w:lang w:val="it-IT"/>
               </w:rPr>
-              <w:t>Nessuna</w:t>
+              <w:t>Se esiste un altro utente con lo stesso username, viene mostrato un messaggio di errore e si ritorna al passo 3</w:t>
             </w:r>
           </w:p>
         </w:tc>
@@ -11862,124 +11827,12 @@
                 <w:rFonts w:ascii="Arial" w:eastAsia="Times New Roman" w:hAnsi="Arial" w:cs="Arial"/>
                 <w:lang w:val="it-IT"/>
               </w:rPr>
-              <w:t xml:space="preserve">Il paziente viene associato al diabetologo </w:t>
-            </w:r>
-            <w:r>
-              <w:rPr>
-                <w:rFonts w:ascii="Arial" w:eastAsia="Times New Roman" w:hAnsi="Arial" w:cs="Arial"/>
-                <w:lang w:val="it-IT"/>
-              </w:rPr>
-              <w:t>selezionato</w:t>
+              <w:t>Il nuovo utente viene creato ed è abilitato all’accesso</w:t>
             </w:r>
           </w:p>
         </w:tc>
       </w:tr>
     </w:tbl>
-    <w:p>
-      <w:pPr>
-        <w:rPr>
-          <w:lang w:val="it-IT"/>
-        </w:rPr>
-      </w:pPr>
-    </w:p>
-    <w:p>
-      <w:pPr>
-        <w:rPr>
-          <w:lang w:val="it-IT"/>
-        </w:rPr>
-      </w:pPr>
-    </w:p>
-    <w:p>
-      <w:pPr>
-        <w:rPr>
-          <w:lang w:val="it-IT"/>
-        </w:rPr>
-      </w:pPr>
-    </w:p>
-    <w:p>
-      <w:pPr>
-        <w:rPr>
-          <w:lang w:val="it-IT"/>
-        </w:rPr>
-      </w:pPr>
-    </w:p>
-    <w:p>
-      <w:pPr>
-        <w:rPr>
-          <w:lang w:val="it-IT"/>
-        </w:rPr>
-      </w:pPr>
-    </w:p>
-    <w:p>
-      <w:pPr>
-        <w:rPr>
-          <w:lang w:val="it-IT"/>
-        </w:rPr>
-      </w:pPr>
-    </w:p>
-    <w:p>
-      <w:pPr>
-        <w:rPr>
-          <w:lang w:val="it-IT"/>
-        </w:rPr>
-      </w:pPr>
-    </w:p>
-    <w:p>
-      <w:pPr>
-        <w:rPr>
-          <w:lang w:val="it-IT"/>
-        </w:rPr>
-      </w:pPr>
-    </w:p>
-    <w:p>
-      <w:pPr>
-        <w:rPr>
-          <w:lang w:val="it-IT"/>
-        </w:rPr>
-      </w:pPr>
-    </w:p>
-    <w:p>
-      <w:pPr>
-        <w:rPr>
-          <w:lang w:val="it-IT"/>
-        </w:rPr>
-      </w:pPr>
-    </w:p>
-    <w:p>
-      <w:pPr>
-        <w:rPr>
-          <w:lang w:val="it-IT"/>
-        </w:rPr>
-      </w:pPr>
-    </w:p>
-    <w:p>
-      <w:pPr>
-        <w:rPr>
-          <w:lang w:val="it-IT"/>
-        </w:rPr>
-      </w:pPr>
-    </w:p>
-    <w:p>
-      <w:pPr>
-        <w:rPr>
-          <w:lang w:val="it-IT"/>
-        </w:rPr>
-      </w:pPr>
-    </w:p>
-    <w:p>
-      <w:pPr>
-        <w:rPr>
-          <w:lang w:val="it-IT"/>
-        </w:rPr>
-      </w:pPr>
-    </w:p>
-    <w:p>
-      <w:pPr>
-        <w:rPr>
-          <w:lang w:val="it-IT"/>
-        </w:rPr>
-      </w:pPr>
-    </w:p>
     <w:p>
       <w:pPr>
         <w:rPr>
@@ -12102,7 +11955,14 @@
                 <w:rFonts w:ascii="Arial" w:eastAsia="Times New Roman" w:hAnsi="Arial" w:cs="Arial"/>
                 <w:lang w:val="it-IT"/>
               </w:rPr>
-              <w:t>12b</w:t>
+              <w:t>13</w:t>
+            </w:r>
+            <w:r>
+              <w:rPr>
+                <w:rFonts w:ascii="Arial" w:eastAsia="Times New Roman" w:hAnsi="Arial" w:cs="Arial"/>
+                <w:lang w:val="it-IT"/>
+              </w:rPr>
+              <w:t>a</w:t>
             </w:r>
           </w:p>
         </w:tc>
@@ -12179,14 +12039,7 @@
                 <w:rFonts w:ascii="Arial" w:eastAsia="Times New Roman" w:hAnsi="Arial" w:cs="Arial"/>
                 <w:lang w:val="it-IT"/>
               </w:rPr>
-              <w:t>Assegna</w:t>
-            </w:r>
-            <w:r>
-              <w:rPr>
-                <w:rFonts w:ascii="Arial" w:eastAsia="Times New Roman" w:hAnsi="Arial" w:cs="Arial"/>
-                <w:lang w:val="it-IT"/>
-              </w:rPr>
-              <w:t>Pazienti</w:t>
+              <w:t>AssegnaMedicoDiRiferimento</w:t>
             </w:r>
             <w:proofErr w:type="spellEnd"/>
           </w:p>
@@ -12263,7 +12116,21 @@
                 <w:rFonts w:ascii="Arial" w:eastAsia="Times New Roman" w:hAnsi="Arial" w:cs="Arial"/>
                 <w:lang w:val="it-IT"/>
               </w:rPr>
-              <w:t>Amministratore</w:t>
+              <w:t>Ammin</w:t>
+            </w:r>
+            <w:r>
+              <w:rPr>
+                <w:rFonts w:ascii="Arial" w:eastAsia="Times New Roman" w:hAnsi="Arial" w:cs="Arial"/>
+                <w:lang w:val="it-IT"/>
+              </w:rPr>
+              <w:t>i</w:t>
+            </w:r>
+            <w:r>
+              <w:rPr>
+                <w:rFonts w:ascii="Arial" w:eastAsia="Times New Roman" w:hAnsi="Arial" w:cs="Arial"/>
+                <w:lang w:val="it-IT"/>
+              </w:rPr>
+              <w:t>stratore</w:t>
             </w:r>
           </w:p>
         </w:tc>
@@ -12346,14 +12213,21 @@
                 <w:rFonts w:ascii="Arial" w:eastAsia="Times New Roman" w:hAnsi="Arial" w:cs="Arial"/>
                 <w:lang w:val="it-IT"/>
               </w:rPr>
-              <w:t xml:space="preserve"> </w:t>
-            </w:r>
-            <w:r>
-              <w:rPr>
-                <w:rFonts w:ascii="Arial" w:eastAsia="Times New Roman" w:hAnsi="Arial" w:cs="Arial"/>
-                <w:lang w:val="it-IT"/>
-              </w:rPr>
-              <w:t>uno o più pazienti a un diabetologo</w:t>
+              <w:t xml:space="preserve"> al paziente</w:t>
+            </w:r>
+            <w:r>
+              <w:rPr>
+                <w:rFonts w:ascii="Arial" w:eastAsia="Times New Roman" w:hAnsi="Arial" w:cs="Arial"/>
+                <w:lang w:val="it-IT"/>
+              </w:rPr>
+              <w:t xml:space="preserve"> un diabeto</w:t>
+            </w:r>
+            <w:r>
+              <w:rPr>
+                <w:rFonts w:ascii="Arial" w:eastAsia="Times New Roman" w:hAnsi="Arial" w:cs="Arial"/>
+                <w:lang w:val="it-IT"/>
+              </w:rPr>
+              <w:t>logo come medico di riferimento</w:t>
             </w:r>
           </w:p>
         </w:tc>
@@ -12436,14 +12310,7 @@
                 <w:rFonts w:ascii="Arial" w:eastAsia="Times New Roman" w:hAnsi="Arial" w:cs="Arial"/>
                 <w:lang w:val="it-IT"/>
               </w:rPr>
-              <w:t xml:space="preserve"> in corso la creazione o modifica di un account </w:t>
-            </w:r>
-            <w:r>
-              <w:rPr>
-                <w:rFonts w:ascii="Arial" w:eastAsia="Times New Roman" w:hAnsi="Arial" w:cs="Arial"/>
-                <w:lang w:val="it-IT"/>
-              </w:rPr>
-              <w:t>diabetologo</w:t>
+              <w:t xml:space="preserve"> in corso la creazione o modifica di un account paziente</w:t>
             </w:r>
           </w:p>
         </w:tc>
@@ -12511,7 +12378,7 @@
               <w:pStyle w:val="Paragrafoelenco"/>
               <w:numPr>
                 <w:ilvl w:val="0"/>
-                <w:numId w:val="16"/>
+                <w:numId w:val="15"/>
               </w:numPr>
               <w:spacing w:before="210" w:after="210"/>
               <w:rPr>
@@ -12548,7 +12415,7 @@
               <w:pStyle w:val="Paragrafoelenco"/>
               <w:numPr>
                 <w:ilvl w:val="0"/>
-                <w:numId w:val="16"/>
+                <w:numId w:val="15"/>
               </w:numPr>
               <w:spacing w:before="210" w:after="210"/>
               <w:rPr>
@@ -12561,14 +12428,7 @@
                 <w:rFonts w:ascii="Arial" w:eastAsia="Times New Roman" w:hAnsi="Arial" w:cs="Arial"/>
                 <w:lang w:val="it-IT"/>
               </w:rPr>
-              <w:t xml:space="preserve">Il sistema mostra l’elenco dei </w:t>
-            </w:r>
-            <w:r>
-              <w:rPr>
-                <w:rFonts w:ascii="Arial" w:eastAsia="Times New Roman" w:hAnsi="Arial" w:cs="Arial"/>
-                <w:lang w:val="it-IT"/>
-              </w:rPr>
-              <w:t>pazienti</w:t>
+              <w:t>Il sistema mostra l’elenco dei diabetologi</w:t>
             </w:r>
           </w:p>
           <w:p>
@@ -12576,7 +12436,7 @@
               <w:pStyle w:val="Paragrafoelenco"/>
               <w:numPr>
                 <w:ilvl w:val="0"/>
-                <w:numId w:val="16"/>
+                <w:numId w:val="15"/>
               </w:numPr>
               <w:spacing w:before="210" w:after="210"/>
               <w:rPr>
@@ -12589,14 +12449,7 @@
                 <w:rFonts w:ascii="Arial" w:eastAsia="Times New Roman" w:hAnsi="Arial" w:cs="Arial"/>
                 <w:lang w:val="it-IT"/>
               </w:rPr>
-              <w:t xml:space="preserve">L’amministratore seleziona </w:t>
-            </w:r>
-            <w:r>
-              <w:rPr>
-                <w:rFonts w:ascii="Arial" w:eastAsia="Times New Roman" w:hAnsi="Arial" w:cs="Arial"/>
-                <w:lang w:val="it-IT"/>
-              </w:rPr>
-              <w:t>uno o più pazienti da assegnare</w:t>
+              <w:t>L’amministratore seleziona il diabetologo di riferimento</w:t>
             </w:r>
           </w:p>
         </w:tc>
@@ -12672,7 +12525,7 @@
                 <w:rFonts w:ascii="Arial" w:eastAsia="Times New Roman" w:hAnsi="Arial" w:cs="Arial"/>
                 <w:lang w:val="it-IT"/>
               </w:rPr>
-              <w:t>Se non esiste nessun paziente, il sistema mostra una lista vuota; se non viene selezionato alcun paziente, il medico viene salvato senza pazienti associati</w:t>
+              <w:t>Nessuna</w:t>
             </w:r>
           </w:p>
         </w:tc>
@@ -12750,12 +12603,47 @@
                 <w:rFonts w:ascii="Arial" w:eastAsia="Times New Roman" w:hAnsi="Arial" w:cs="Arial"/>
                 <w:lang w:val="it-IT"/>
               </w:rPr>
-              <w:t>I pazienti vengono associati al diabetologo selezionato</w:t>
+              <w:t xml:space="preserve">Il paziente viene associato al diabetologo </w:t>
+            </w:r>
+            <w:r>
+              <w:rPr>
+                <w:rFonts w:ascii="Arial" w:eastAsia="Times New Roman" w:hAnsi="Arial" w:cs="Arial"/>
+                <w:lang w:val="it-IT"/>
+              </w:rPr>
+              <w:t>selezionato</w:t>
             </w:r>
           </w:p>
         </w:tc>
       </w:tr>
     </w:tbl>
+    <w:p>
+      <w:pPr>
+        <w:rPr>
+          <w:lang w:val="it-IT"/>
+        </w:rPr>
+      </w:pPr>
+    </w:p>
+    <w:p>
+      <w:pPr>
+        <w:rPr>
+          <w:lang w:val="it-IT"/>
+        </w:rPr>
+      </w:pPr>
+    </w:p>
+    <w:p>
+      <w:pPr>
+        <w:rPr>
+          <w:lang w:val="it-IT"/>
+        </w:rPr>
+      </w:pPr>
+    </w:p>
+    <w:p>
+      <w:pPr>
+        <w:rPr>
+          <w:lang w:val="it-IT"/>
+        </w:rPr>
+      </w:pPr>
+    </w:p>
     <w:p>
       <w:pPr>
         <w:rPr>
@@ -12956,7 +12844,21 @@
                 <w:rFonts w:ascii="Arial" w:eastAsia="Times New Roman" w:hAnsi="Arial" w:cs="Arial"/>
                 <w:lang w:val="it-IT"/>
               </w:rPr>
-              <w:t>13</w:t>
+              <w:t>1</w:t>
+            </w:r>
+            <w:r>
+              <w:rPr>
+                <w:rFonts w:ascii="Arial" w:eastAsia="Times New Roman" w:hAnsi="Arial" w:cs="Arial"/>
+                <w:lang w:val="it-IT"/>
+              </w:rPr>
+              <w:t>3</w:t>
+            </w:r>
+            <w:r>
+              <w:rPr>
+                <w:rFonts w:ascii="Arial" w:eastAsia="Times New Roman" w:hAnsi="Arial" w:cs="Arial"/>
+                <w:lang w:val="it-IT"/>
+              </w:rPr>
+              <w:t>b</w:t>
             </w:r>
           </w:p>
         </w:tc>
@@ -13033,7 +12935,14 @@
                 <w:rFonts w:ascii="Arial" w:eastAsia="Times New Roman" w:hAnsi="Arial" w:cs="Arial"/>
                 <w:lang w:val="it-IT"/>
               </w:rPr>
-              <w:t>ModificaDatiUtente</w:t>
+              <w:t>Assegna</w:t>
+            </w:r>
+            <w:r>
+              <w:rPr>
+                <w:rFonts w:ascii="Arial" w:eastAsia="Times New Roman" w:hAnsi="Arial" w:cs="Arial"/>
+                <w:lang w:val="it-IT"/>
+              </w:rPr>
+              <w:t>Pazienti</w:t>
             </w:r>
             <w:proofErr w:type="spellEnd"/>
           </w:p>
@@ -13186,7 +13095,14 @@
                 <w:rFonts w:ascii="Arial" w:eastAsia="Times New Roman" w:hAnsi="Arial" w:cs="Arial"/>
                 <w:lang w:val="it-IT"/>
               </w:rPr>
-              <w:t>L'amministratore modifica i dati anagrafici o di accesso di un utente esistente</w:t>
+              <w:t>L'amministratore associa</w:t>
+            </w:r>
+            <w:r>
+              <w:rPr>
+                <w:rFonts w:ascii="Arial" w:eastAsia="Times New Roman" w:hAnsi="Arial" w:cs="Arial"/>
+                <w:lang w:val="it-IT"/>
+              </w:rPr>
+              <w:t xml:space="preserve"> uno o più pazienti a un diabetologo</w:t>
             </w:r>
           </w:p>
         </w:tc>
@@ -13262,7 +13178,14 @@
                 <w:rFonts w:ascii="Arial" w:eastAsia="Times New Roman" w:hAnsi="Arial" w:cs="Arial"/>
                 <w:lang w:val="it-IT"/>
               </w:rPr>
-              <w:t>L'amministratore ha effettuato il login; l'utente da modificare esiste nel sistema</w:t>
+              <w:t>È</w:t>
+            </w:r>
+            <w:r>
+              <w:rPr>
+                <w:rFonts w:ascii="Arial" w:eastAsia="Times New Roman" w:hAnsi="Arial" w:cs="Arial"/>
+                <w:lang w:val="it-IT"/>
+              </w:rPr>
+              <w:t xml:space="preserve"> in corso la creazione o modifica di un account diabetologo</w:t>
             </w:r>
           </w:p>
         </w:tc>
@@ -13330,22 +13253,36 @@
               <w:pStyle w:val="Paragrafoelenco"/>
               <w:numPr>
                 <w:ilvl w:val="0"/>
-                <w:numId w:val="17"/>
+                <w:numId w:val="16"/>
               </w:numPr>
               <w:spacing w:before="210" w:after="210"/>
               <w:rPr>
                 <w:rFonts w:ascii="Arial" w:eastAsia="Times New Roman" w:hAnsi="Arial" w:cs="Arial"/>
-                <w:color w:val="000000" w:themeColor="text1"/>
-                <w:lang w:val="it-IT"/>
-              </w:rPr>
-            </w:pPr>
-            <w:r>
-              <w:rPr>
-                <w:rFonts w:ascii="Arial" w:eastAsia="Times New Roman" w:hAnsi="Arial" w:cs="Arial"/>
-                <w:color w:val="000000" w:themeColor="text1"/>
-                <w:lang w:val="it-IT"/>
-              </w:rPr>
-              <w:t>L’amministratore clicca sul pulsante “Cambia credenziali”</w:t>
+                <w:lang w:val="it-IT"/>
+              </w:rPr>
+            </w:pPr>
+            <w:r>
+              <w:rPr>
+                <w:rFonts w:ascii="Arial" w:eastAsia="Times New Roman" w:hAnsi="Arial" w:cs="Arial"/>
+                <w:lang w:val="it-IT"/>
+              </w:rPr>
+              <w:t>Include (</w:t>
+            </w:r>
+            <w:proofErr w:type="spellStart"/>
+            <w:r>
+              <w:rPr>
+                <w:rFonts w:ascii="Arial" w:eastAsia="Times New Roman" w:hAnsi="Arial" w:cs="Arial"/>
+                <w:lang w:val="it-IT"/>
+              </w:rPr>
+              <w:t>CreazioneNuovoUtente</w:t>
+            </w:r>
+            <w:proofErr w:type="spellEnd"/>
+            <w:r>
+              <w:rPr>
+                <w:rFonts w:ascii="Arial" w:eastAsia="Times New Roman" w:hAnsi="Arial" w:cs="Arial"/>
+                <w:lang w:val="it-IT"/>
+              </w:rPr>
+              <w:t>)</w:t>
             </w:r>
           </w:p>
           <w:p>
@@ -13353,7 +13290,7 @@
               <w:pStyle w:val="Paragrafoelenco"/>
               <w:numPr>
                 <w:ilvl w:val="0"/>
-                <w:numId w:val="17"/>
+                <w:numId w:val="16"/>
               </w:numPr>
               <w:spacing w:before="210" w:after="210"/>
               <w:rPr>
@@ -13364,10 +13301,44 @@
             <w:r>
               <w:rPr>
                 <w:rFonts w:ascii="Arial" w:eastAsia="Times New Roman" w:hAnsi="Arial" w:cs="Arial"/>
-                <w:color w:val="000000" w:themeColor="text1"/>
-                <w:lang w:val="it-IT"/>
-              </w:rPr>
-              <w:t>L’amministratore modifica le credenziali del profilo selezionato</w:t>
+                <w:lang w:val="it-IT"/>
+              </w:rPr>
+              <w:t xml:space="preserve">Il sistema mostra l’elenco dei </w:t>
+            </w:r>
+            <w:r>
+              <w:rPr>
+                <w:rFonts w:ascii="Arial" w:eastAsia="Times New Roman" w:hAnsi="Arial" w:cs="Arial"/>
+                <w:lang w:val="it-IT"/>
+              </w:rPr>
+              <w:t>pazienti</w:t>
+            </w:r>
+          </w:p>
+          <w:p>
+            <w:pPr>
+              <w:pStyle w:val="Paragrafoelenco"/>
+              <w:numPr>
+                <w:ilvl w:val="0"/>
+                <w:numId w:val="16"/>
+              </w:numPr>
+              <w:spacing w:before="210" w:after="210"/>
+              <w:rPr>
+                <w:rFonts w:ascii="Arial" w:eastAsia="Times New Roman" w:hAnsi="Arial" w:cs="Arial"/>
+                <w:lang w:val="it-IT"/>
+              </w:rPr>
+            </w:pPr>
+            <w:r>
+              <w:rPr>
+                <w:rFonts w:ascii="Arial" w:eastAsia="Times New Roman" w:hAnsi="Arial" w:cs="Arial"/>
+                <w:lang w:val="it-IT"/>
+              </w:rPr>
+              <w:t xml:space="preserve">L’amministratore seleziona </w:t>
+            </w:r>
+            <w:r>
+              <w:rPr>
+                <w:rFonts w:ascii="Arial" w:eastAsia="Times New Roman" w:hAnsi="Arial" w:cs="Arial"/>
+                <w:lang w:val="it-IT"/>
+              </w:rPr>
+              <w:t>uno o più pazienti da assegnare</w:t>
             </w:r>
           </w:p>
         </w:tc>
@@ -13443,50 +13414,7 @@
                 <w:rFonts w:ascii="Arial" w:eastAsia="Times New Roman" w:hAnsi="Arial" w:cs="Arial"/>
                 <w:lang w:val="it-IT"/>
               </w:rPr>
-              <w:t xml:space="preserve">Se non esiste nessun </w:t>
-            </w:r>
-            <w:r>
-              <w:rPr>
-                <w:rFonts w:ascii="Arial" w:eastAsia="Times New Roman" w:hAnsi="Arial" w:cs="Arial"/>
-                <w:lang w:val="it-IT"/>
-              </w:rPr>
-              <w:t>utente</w:t>
-            </w:r>
-            <w:r>
-              <w:rPr>
-                <w:rFonts w:ascii="Arial" w:eastAsia="Times New Roman" w:hAnsi="Arial" w:cs="Arial"/>
-                <w:lang w:val="it-IT"/>
-              </w:rPr>
-              <w:t xml:space="preserve">, il sistema mostra una lista vuota; </w:t>
-            </w:r>
-            <w:r>
-              <w:rPr>
-                <w:rFonts w:ascii="Arial" w:eastAsia="Times New Roman" w:hAnsi="Arial" w:cs="Arial"/>
-                <w:lang w:val="it-IT"/>
-              </w:rPr>
-              <w:t>s</w:t>
-            </w:r>
-            <w:r>
-              <w:rPr>
-                <w:rFonts w:ascii="Arial" w:eastAsia="Times New Roman" w:hAnsi="Arial" w:cs="Arial"/>
-                <w:lang w:val="it-IT"/>
-              </w:rPr>
-              <w:t>e esiste un altro utente con lo stesso username, viene mostrato un messaggio di errore</w:t>
-            </w:r>
-            <w:r>
-              <w:rPr>
-                <w:rFonts w:ascii="Arial" w:eastAsia="Times New Roman" w:hAnsi="Arial" w:cs="Arial"/>
-                <w:lang w:val="it-IT"/>
-              </w:rPr>
-              <w:t xml:space="preserve"> e si ritorna al punto </w:t>
-            </w:r>
-            <w:r>
-              <w:rPr>
-                <w:rFonts w:ascii="Arial" w:eastAsia="Times New Roman" w:hAnsi="Arial" w:cs="Arial"/>
-                <w:color w:val="000000" w:themeColor="text1"/>
-                <w:lang w:val="it-IT"/>
-              </w:rPr>
-              <w:t>2</w:t>
+              <w:t>Se non esiste nessun paziente, il sistema mostra una lista vuota; se non viene selezionato alcun paziente, il medico viene salvato senza pazienti associati</w:t>
             </w:r>
           </w:p>
         </w:tc>
@@ -13570,13 +13498,6 @@
         </w:tc>
       </w:tr>
     </w:tbl>
-    <w:p>
-      <w:pPr>
-        <w:rPr>
-          <w:lang w:val="it-IT"/>
-        </w:rPr>
-      </w:pPr>
-    </w:p>
     <w:p>
       <w:pPr>
         <w:rPr>
@@ -13755,6 +13676,7 @@
                 <w:bCs/>
                 <w:lang w:val="it-IT"/>
               </w:rPr>
+              <w:lastRenderedPageBreak/>
               <w:t>ID</w:t>
             </w:r>
           </w:p>
@@ -13867,7 +13789,7 @@
                 <w:rFonts w:ascii="Arial" w:eastAsia="Times New Roman" w:hAnsi="Arial" w:cs="Arial"/>
                 <w:lang w:val="it-IT"/>
               </w:rPr>
-              <w:t>ConsultazioneLog</w:t>
+              <w:t>ModificaDatiUtente</w:t>
             </w:r>
             <w:proofErr w:type="spellEnd"/>
           </w:p>
@@ -14020,14 +13942,7 @@
                 <w:rFonts w:ascii="Arial" w:eastAsia="Times New Roman" w:hAnsi="Arial" w:cs="Arial"/>
                 <w:lang w:val="it-IT"/>
               </w:rPr>
-              <w:t xml:space="preserve">L'amministratore </w:t>
-            </w:r>
-            <w:r>
-              <w:rPr>
-                <w:rFonts w:ascii="Arial" w:eastAsia="Times New Roman" w:hAnsi="Arial" w:cs="Arial"/>
-                <w:lang w:val="it-IT"/>
-              </w:rPr>
-              <w:t>consulta il registro delle operazioni effettuate dai diabetologi</w:t>
+              <w:t>L'amministratore modifica i dati anagrafici o di accesso di un utente esistente</w:t>
             </w:r>
           </w:p>
         </w:tc>
@@ -14103,7 +14018,7 @@
                 <w:rFonts w:ascii="Arial" w:eastAsia="Times New Roman" w:hAnsi="Arial" w:cs="Arial"/>
                 <w:lang w:val="it-IT"/>
               </w:rPr>
-              <w:t>L'amministratore ha effettuato il login</w:t>
+              <w:t>L'amministratore ha effettuato il login; l'utente da modificare esiste nel sistema</w:t>
             </w:r>
           </w:p>
         </w:tc>
@@ -14171,31 +14086,44 @@
               <w:pStyle w:val="Paragrafoelenco"/>
               <w:numPr>
                 <w:ilvl w:val="0"/>
-                <w:numId w:val="18"/>
+                <w:numId w:val="17"/>
               </w:numPr>
               <w:spacing w:before="210" w:after="210"/>
               <w:rPr>
                 <w:rFonts w:ascii="Arial" w:eastAsia="Times New Roman" w:hAnsi="Arial" w:cs="Arial"/>
-                <w:lang w:val="it-IT"/>
-              </w:rPr>
-            </w:pPr>
-            <w:r>
-              <w:rPr>
-                <w:rFonts w:ascii="Arial" w:eastAsia="Times New Roman" w:hAnsi="Arial" w:cs="Arial"/>
-                <w:color w:val="FF0000"/>
-                <w:lang w:val="it-IT"/>
-              </w:rPr>
-              <w:t>????????????</w:t>
-            </w:r>
-            <w:bookmarkStart w:id="0" w:name="_GoBack"/>
-            <w:bookmarkEnd w:id="0"/>
-            <w:r>
-              <w:rPr>
-                <w:rFonts w:ascii="Arial" w:eastAsia="Times New Roman" w:hAnsi="Arial" w:cs="Arial"/>
-                <w:color w:val="FF0000"/>
-                <w:lang w:val="it-IT"/>
-              </w:rPr>
-              <w:t>?????????</w:t>
+                <w:color w:val="000000" w:themeColor="text1"/>
+                <w:lang w:val="it-IT"/>
+              </w:rPr>
+            </w:pPr>
+            <w:r>
+              <w:rPr>
+                <w:rFonts w:ascii="Arial" w:eastAsia="Times New Roman" w:hAnsi="Arial" w:cs="Arial"/>
+                <w:color w:val="000000" w:themeColor="text1"/>
+                <w:lang w:val="it-IT"/>
+              </w:rPr>
+              <w:t>L’amministratore clicca sul pulsante “Cambia credenziali”</w:t>
+            </w:r>
+          </w:p>
+          <w:p>
+            <w:pPr>
+              <w:pStyle w:val="Paragrafoelenco"/>
+              <w:numPr>
+                <w:ilvl w:val="0"/>
+                <w:numId w:val="17"/>
+              </w:numPr>
+              <w:spacing w:before="210" w:after="210"/>
+              <w:rPr>
+                <w:rFonts w:ascii="Arial" w:eastAsia="Times New Roman" w:hAnsi="Arial" w:cs="Arial"/>
+                <w:lang w:val="it-IT"/>
+              </w:rPr>
+            </w:pPr>
+            <w:r>
+              <w:rPr>
+                <w:rFonts w:ascii="Arial" w:eastAsia="Times New Roman" w:hAnsi="Arial" w:cs="Arial"/>
+                <w:color w:val="000000" w:themeColor="text1"/>
+                <w:lang w:val="it-IT"/>
+              </w:rPr>
+              <w:t>L’amministratore modifica le credenziali del profilo selezionato</w:t>
             </w:r>
           </w:p>
         </w:tc>
@@ -14271,35 +14199,36 @@
                 <w:rFonts w:ascii="Arial" w:eastAsia="Times New Roman" w:hAnsi="Arial" w:cs="Arial"/>
                 <w:lang w:val="it-IT"/>
               </w:rPr>
-              <w:t xml:space="preserve">Se non </w:t>
-            </w:r>
-            <w:r>
-              <w:rPr>
-                <w:rFonts w:ascii="Arial" w:eastAsia="Times New Roman" w:hAnsi="Arial" w:cs="Arial"/>
-                <w:lang w:val="it-IT"/>
-              </w:rPr>
-              <w:t>è stata effettuata</w:t>
-            </w:r>
-            <w:r>
-              <w:rPr>
-                <w:rFonts w:ascii="Arial" w:eastAsia="Times New Roman" w:hAnsi="Arial" w:cs="Arial"/>
-                <w:lang w:val="it-IT"/>
-              </w:rPr>
-              <w:t xml:space="preserve"> nessun</w:t>
-            </w:r>
-            <w:r>
-              <w:rPr>
-                <w:rFonts w:ascii="Arial" w:eastAsia="Times New Roman" w:hAnsi="Arial" w:cs="Arial"/>
-                <w:lang w:val="it-IT"/>
-              </w:rPr>
-              <w:t>a operazione</w:t>
-            </w:r>
-            <w:r>
-              <w:rPr>
-                <w:rFonts w:ascii="Arial" w:eastAsia="Times New Roman" w:hAnsi="Arial" w:cs="Arial"/>
-                <w:lang w:val="it-IT"/>
-              </w:rPr>
-              <w:t>, il sistema mostra una lista vuota</w:t>
+              <w:t xml:space="preserve">Se non esiste nessun </w:t>
+            </w:r>
+            <w:r>
+              <w:rPr>
+                <w:rFonts w:ascii="Arial" w:eastAsia="Times New Roman" w:hAnsi="Arial" w:cs="Arial"/>
+                <w:lang w:val="it-IT"/>
+              </w:rPr>
+              <w:t>utente</w:t>
+            </w:r>
+            <w:r>
+              <w:rPr>
+                <w:rFonts w:ascii="Arial" w:eastAsia="Times New Roman" w:hAnsi="Arial" w:cs="Arial"/>
+                <w:lang w:val="it-IT"/>
+              </w:rPr>
+              <w:t xml:space="preserve">, il sistema mostra una lista vuota; </w:t>
+            </w:r>
+            <w:r>
+              <w:rPr>
+                <w:rFonts w:ascii="Arial" w:eastAsia="Times New Roman" w:hAnsi="Arial" w:cs="Arial"/>
+                <w:lang w:val="it-IT"/>
+              </w:rPr>
+              <w:t xml:space="preserve">se esiste un altro utente con lo stesso username, viene mostrato un messaggio di errore e si ritorna al punto </w:t>
+            </w:r>
+            <w:r>
+              <w:rPr>
+                <w:rFonts w:ascii="Arial" w:eastAsia="Times New Roman" w:hAnsi="Arial" w:cs="Arial"/>
+                <w:color w:val="000000" w:themeColor="text1"/>
+                <w:lang w:val="it-IT"/>
+              </w:rPr>
+              <w:t>2</w:t>
             </w:r>
           </w:p>
         </w:tc>
@@ -14377,7 +14306,7 @@
                 <w:rFonts w:ascii="Arial" w:eastAsia="Times New Roman" w:hAnsi="Arial" w:cs="Arial"/>
                 <w:lang w:val="it-IT"/>
               </w:rPr>
-              <w:t>Nessuna</w:t>
+              <w:t>I pazienti vengono associati al diabetologo selezionato</w:t>
             </w:r>
           </w:p>
         </w:tc>
@@ -14410,6 +14339,106 @@
           <w:lang w:val="it-IT"/>
         </w:rPr>
       </w:pPr>
+    </w:p>
+    <w:p>
+      <w:pPr>
+        <w:rPr>
+          <w:lang w:val="it-IT"/>
+        </w:rPr>
+      </w:pPr>
+    </w:p>
+    <w:p>
+      <w:pPr>
+        <w:rPr>
+          <w:lang w:val="it-IT"/>
+        </w:rPr>
+      </w:pPr>
+    </w:p>
+    <w:p>
+      <w:pPr>
+        <w:rPr>
+          <w:lang w:val="it-IT"/>
+        </w:rPr>
+      </w:pPr>
+    </w:p>
+    <w:p>
+      <w:pPr>
+        <w:rPr>
+          <w:lang w:val="it-IT"/>
+        </w:rPr>
+      </w:pPr>
+    </w:p>
+    <w:p>
+      <w:pPr>
+        <w:rPr>
+          <w:lang w:val="it-IT"/>
+        </w:rPr>
+      </w:pPr>
+    </w:p>
+    <w:p>
+      <w:pPr>
+        <w:rPr>
+          <w:lang w:val="it-IT"/>
+        </w:rPr>
+      </w:pPr>
+    </w:p>
+    <w:p>
+      <w:pPr>
+        <w:rPr>
+          <w:lang w:val="it-IT"/>
+        </w:rPr>
+      </w:pPr>
+    </w:p>
+    <w:p>
+      <w:pPr>
+        <w:rPr>
+          <w:lang w:val="it-IT"/>
+        </w:rPr>
+      </w:pPr>
+    </w:p>
+    <w:p>
+      <w:pPr>
+        <w:rPr>
+          <w:lang w:val="it-IT"/>
+        </w:rPr>
+      </w:pPr>
+    </w:p>
+    <w:p>
+      <w:pPr>
+        <w:rPr>
+          <w:lang w:val="it-IT"/>
+        </w:rPr>
+      </w:pPr>
+    </w:p>
+    <w:p>
+      <w:pPr>
+        <w:rPr>
+          <w:lang w:val="it-IT"/>
+        </w:rPr>
+      </w:pPr>
+    </w:p>
+    <w:p>
+      <w:pPr>
+        <w:rPr>
+          <w:lang w:val="it-IT"/>
+        </w:rPr>
+      </w:pPr>
+    </w:p>
+    <w:p>
+      <w:pPr>
+        <w:rPr>
+          <w:lang w:val="it-IT"/>
+        </w:rPr>
+      </w:pPr>
+    </w:p>
+    <w:p>
+      <w:pPr>
+        <w:rPr>
+          <w:lang w:val="it-IT"/>
+        </w:rPr>
+      </w:pPr>
+      <w:bookmarkStart w:id="0" w:name="_GoBack"/>
+      <w:bookmarkEnd w:id="0"/>
     </w:p>
     <w:sectPr>
       <w:pgSz w:w="11906" w:h="16838"/>
@@ -16533,6 +16562,7 @@
   <w:style w:type="character" w:default="1" w:styleId="Carpredefinitoparagrafo">
     <w:name w:val="Default Paragraph Font"/>
     <w:uiPriority w:val="1"/>
+    <w:semiHidden/>
     <w:unhideWhenUsed/>
   </w:style>
   <w:style w:type="table" w:default="1" w:styleId="Tabellanormale">
@@ -17325,6 +17355,7 @@
   <w:style w:type="character" w:default="1" w:styleId="Carpredefinitoparagrafo">
     <w:name w:val="Default Paragraph Font"/>
     <w:uiPriority w:val="1"/>
+    <w:semiHidden/>
     <w:unhideWhenUsed/>
   </w:style>
   <w:style w:type="table" w:default="1" w:styleId="Tabellanormale">
@@ -18005,7 +18036,7 @@
   <a:extraClrSchemeLst/>
   <a:extLst>
     <a:ext uri="{05A4C25C-085E-4340-85A3-A5531E510DB2}">
-      <thm15:themeFamily xmlns="" xmlns:thm15="http://schemas.microsoft.com/office/thememl/2012/main" name="Office Theme" id="{62F939B6-93AF-4DB8-9C6B-D6C7DFDC589F}" vid="{4A3C46E8-61CC-4603-A589-7422A47A8E4A}"/>
+      <thm15:themeFamily xmlns:thm15="http://schemas.microsoft.com/office/thememl/2012/main" xmlns="" name="Office Theme" id="{62F939B6-93AF-4DB8-9C6B-D6C7DFDC589F}" vid="{4A3C46E8-61CC-4603-A589-7422A47A8E4A}"/>
     </a:ext>
   </a:extLst>
 </a:theme>

</xml_diff>